<commit_message>
Az1 part 3 doc
</commit_message>
<xml_diff>
--- a/Az1/GozAz1.docx
+++ b/Az1/GozAz1.docx
@@ -18,7 +18,7 @@
           <w:szCs w:val="48"/>
         </w:rPr>
         <w:drawing>
-          <wp:inline distT="0" distB="0" distL="0" distR="0" wp14:anchorId="55C0CFEE" wp14:editId="39E8ECAF">
+          <wp:inline distT="0" distB="0" distL="0" distR="0" wp14:anchorId="55C0CFEE" wp14:editId="47D0DE53">
             <wp:extent cx="1045634" cy="1045634"/>
             <wp:effectExtent l="0" t="0" r="2540" b="2540"/>
             <wp:docPr id="1059743664" name="Picture 2"/>
@@ -218,7 +218,17 @@
           <w:rtl/>
           <w:lang w:bidi="fa-IR"/>
         </w:rPr>
-        <w:t>گروه شماره 2</w:t>
+        <w:t xml:space="preserve">گروه شماره </w:t>
+      </w:r>
+      <w:r>
+        <w:rPr>
+          <w:rFonts w:cs="B Yekan" w:hint="cs"/>
+          <w:sz w:val="28"/>
+          <w:szCs w:val="28"/>
+          <w:rtl/>
+          <w:lang w:bidi="fa-IR"/>
+        </w:rPr>
+        <w:t>7</w:t>
       </w:r>
     </w:p>
     <w:p>
@@ -262,7 +272,27 @@
           <w:rtl/>
           <w:lang w:bidi="fa-IR"/>
         </w:rPr>
-        <w:t>محمدرضا اژدری                 -                   404105434</w:t>
+        <w:t xml:space="preserve">رضا قضاوی       </w:t>
+      </w:r>
+      <w:r>
+        <w:rPr>
+          <w:rFonts w:cs="B Yekan" w:hint="cs"/>
+          <w:sz w:val="20"/>
+          <w:szCs w:val="20"/>
+          <w:rtl/>
+          <w:lang w:bidi="fa-IR"/>
+        </w:rPr>
+        <w:t xml:space="preserve">                 -                   </w:t>
+      </w:r>
+      <w:r>
+        <w:rPr>
+          <w:rFonts w:cs="B Yekan" w:hint="cs"/>
+          <w:sz w:val="20"/>
+          <w:szCs w:val="20"/>
+          <w:rtl/>
+          <w:lang w:bidi="fa-IR"/>
+        </w:rPr>
+        <w:t>404106236</w:t>
       </w:r>
     </w:p>
     <w:tbl>
@@ -294,7 +324,7 @@
             <w:pPr>
               <w:jc w:val="right"/>
               <w:rPr>
-                <w:rFonts w:cs="B Yekan" w:hint="cs"/>
+                <w:rFonts w:cs="B Yekan"/>
                 <w:sz w:val="20"/>
                 <w:szCs w:val="20"/>
                 <w:rtl/>
@@ -322,7 +352,7 @@
             <w:pPr>
               <w:jc w:val="center"/>
               <w:rPr>
-                <w:rFonts w:cs="B Yekan" w:hint="cs"/>
+                <w:rFonts w:cs="B Yekan"/>
                 <w:sz w:val="20"/>
                 <w:szCs w:val="20"/>
                 <w:rtl/>
@@ -339,13 +369,33 @@
             <w:pPr>
               <w:jc w:val="right"/>
               <w:rPr>
+                <w:rFonts w:cs="B Yekan"/>
+                <w:sz w:val="20"/>
+                <w:szCs w:val="20"/>
+                <w:rtl/>
+                <w:lang w:bidi="fa-IR"/>
+              </w:rPr>
+            </w:pPr>
+            <w:r>
+              <w:rPr>
                 <w:rFonts w:cs="B Yekan" w:hint="cs"/>
                 <w:sz w:val="20"/>
                 <w:szCs w:val="20"/>
                 <w:rtl/>
                 <w:lang w:bidi="fa-IR"/>
               </w:rPr>
-            </w:pPr>
+              <w:t xml:space="preserve">آزمایشگاه مدار های منطقی </w:t>
+            </w:r>
+            <w:r>
+              <w:rPr>
+                <w:rFonts w:ascii="Arial" w:hAnsi="Arial" w:cs="Arial" w:hint="cs"/>
+                <w:sz w:val="20"/>
+                <w:szCs w:val="20"/>
+                <w:rtl/>
+                <w:lang w:bidi="fa-IR"/>
+              </w:rPr>
+              <w:t>–</w:t>
+            </w:r>
             <w:r>
               <w:rPr>
                 <w:rFonts w:cs="B Yekan" w:hint="cs"/>
@@ -354,17 +404,7 @@
                 <w:rtl/>
                 <w:lang w:bidi="fa-IR"/>
               </w:rPr>
-              <w:t xml:space="preserve">آزمایشگاه مدار های منطقی </w:t>
-            </w:r>
-            <w:r>
-              <w:rPr>
-                <w:rFonts w:ascii="Arial" w:hAnsi="Arial" w:cs="Arial" w:hint="cs"/>
-                <w:sz w:val="20"/>
-                <w:szCs w:val="20"/>
-                <w:rtl/>
-                <w:lang w:bidi="fa-IR"/>
-              </w:rPr>
-              <w:t>–</w:t>
+              <w:t xml:space="preserve"> گروه شماره </w:t>
             </w:r>
             <w:r>
               <w:rPr>
@@ -374,7 +414,7 @@
                 <w:rtl/>
                 <w:lang w:bidi="fa-IR"/>
               </w:rPr>
-              <w:t xml:space="preserve"> گروه شماره 2</w:t>
+              <w:t>7</w:t>
             </w:r>
           </w:p>
         </w:tc>
@@ -450,7 +490,7 @@
             <w:pPr>
               <w:jc w:val="right"/>
               <w:rPr>
-                <w:rFonts w:cs="B Yekan" w:hint="cs"/>
+                <w:rFonts w:cs="B Yekan"/>
                 <w:sz w:val="20"/>
                 <w:szCs w:val="20"/>
                 <w:rtl/>
@@ -478,7 +518,7 @@
             <w:pPr>
               <w:jc w:val="center"/>
               <w:rPr>
-                <w:rFonts w:cs="B Yekan" w:hint="cs"/>
+                <w:rFonts w:cs="B Yekan"/>
                 <w:sz w:val="20"/>
                 <w:szCs w:val="20"/>
                 <w:rtl/>
@@ -495,13 +535,33 @@
             <w:pPr>
               <w:jc w:val="right"/>
               <w:rPr>
+                <w:rFonts w:cs="B Yekan"/>
+                <w:sz w:val="20"/>
+                <w:szCs w:val="20"/>
+                <w:rtl/>
+                <w:lang w:bidi="fa-IR"/>
+              </w:rPr>
+            </w:pPr>
+            <w:r>
+              <w:rPr>
                 <w:rFonts w:cs="B Yekan" w:hint="cs"/>
                 <w:sz w:val="20"/>
                 <w:szCs w:val="20"/>
                 <w:rtl/>
                 <w:lang w:bidi="fa-IR"/>
               </w:rPr>
-            </w:pPr>
+              <w:t xml:space="preserve">آزمایشگاه مدار های منطقی </w:t>
+            </w:r>
+            <w:r>
+              <w:rPr>
+                <w:rFonts w:ascii="Arial" w:hAnsi="Arial" w:cs="Arial" w:hint="cs"/>
+                <w:sz w:val="20"/>
+                <w:szCs w:val="20"/>
+                <w:rtl/>
+                <w:lang w:bidi="fa-IR"/>
+              </w:rPr>
+              <w:t>–</w:t>
+            </w:r>
             <w:r>
               <w:rPr>
                 <w:rFonts w:cs="B Yekan" w:hint="cs"/>
@@ -510,17 +570,7 @@
                 <w:rtl/>
                 <w:lang w:bidi="fa-IR"/>
               </w:rPr>
-              <w:t xml:space="preserve">آزمایشگاه مدار های منطقی </w:t>
-            </w:r>
-            <w:r>
-              <w:rPr>
-                <w:rFonts w:ascii="Arial" w:hAnsi="Arial" w:cs="Arial" w:hint="cs"/>
-                <w:sz w:val="20"/>
-                <w:szCs w:val="20"/>
-                <w:rtl/>
-                <w:lang w:bidi="fa-IR"/>
-              </w:rPr>
-              <w:t>–</w:t>
+              <w:t xml:space="preserve"> گروه شماره </w:t>
             </w:r>
             <w:r>
               <w:rPr>
@@ -530,7 +580,7 @@
                 <w:rtl/>
                 <w:lang w:bidi="fa-IR"/>
               </w:rPr>
-              <w:t xml:space="preserve"> گروه شماره 2</w:t>
+              <w:t>7</w:t>
             </w:r>
           </w:p>
         </w:tc>
@@ -577,7 +627,7 @@
             <w:pPr>
               <w:jc w:val="right"/>
               <w:rPr>
-                <w:rFonts w:cs="B Yekan" w:hint="cs"/>
+                <w:rFonts w:cs="B Yekan"/>
                 <w:sz w:val="20"/>
                 <w:szCs w:val="20"/>
                 <w:rtl/>
@@ -605,7 +655,7 @@
             <w:pPr>
               <w:jc w:val="center"/>
               <w:rPr>
-                <w:rFonts w:cs="B Yekan" w:hint="cs"/>
+                <w:rFonts w:cs="B Yekan"/>
                 <w:sz w:val="20"/>
                 <w:szCs w:val="20"/>
                 <w:rtl/>
@@ -622,13 +672,33 @@
             <w:pPr>
               <w:jc w:val="right"/>
               <w:rPr>
+                <w:rFonts w:cs="B Yekan"/>
+                <w:sz w:val="20"/>
+                <w:szCs w:val="20"/>
+                <w:rtl/>
+                <w:lang w:bidi="fa-IR"/>
+              </w:rPr>
+            </w:pPr>
+            <w:r>
+              <w:rPr>
                 <w:rFonts w:cs="B Yekan" w:hint="cs"/>
                 <w:sz w:val="20"/>
                 <w:szCs w:val="20"/>
                 <w:rtl/>
                 <w:lang w:bidi="fa-IR"/>
               </w:rPr>
-            </w:pPr>
+              <w:t xml:space="preserve">آزمایشگاه مدار های منطقی </w:t>
+            </w:r>
+            <w:r>
+              <w:rPr>
+                <w:rFonts w:ascii="Arial" w:hAnsi="Arial" w:cs="Arial" w:hint="cs"/>
+                <w:sz w:val="20"/>
+                <w:szCs w:val="20"/>
+                <w:rtl/>
+                <w:lang w:bidi="fa-IR"/>
+              </w:rPr>
+              <w:t>–</w:t>
+            </w:r>
             <w:r>
               <w:rPr>
                 <w:rFonts w:cs="B Yekan" w:hint="cs"/>
@@ -637,17 +707,7 @@
                 <w:rtl/>
                 <w:lang w:bidi="fa-IR"/>
               </w:rPr>
-              <w:t xml:space="preserve">آزمایشگاه مدار های منطقی </w:t>
-            </w:r>
-            <w:r>
-              <w:rPr>
-                <w:rFonts w:ascii="Arial" w:hAnsi="Arial" w:cs="Arial" w:hint="cs"/>
-                <w:sz w:val="20"/>
-                <w:szCs w:val="20"/>
-                <w:rtl/>
-                <w:lang w:bidi="fa-IR"/>
-              </w:rPr>
-              <w:t>–</w:t>
+              <w:t xml:space="preserve"> گروه شماره </w:t>
             </w:r>
             <w:r>
               <w:rPr>
@@ -657,7 +717,7 @@
                 <w:rtl/>
                 <w:lang w:bidi="fa-IR"/>
               </w:rPr>
-              <w:t xml:space="preserve"> گروه شماره 2</w:t>
+              <w:t>7</w:t>
             </w:r>
           </w:p>
         </w:tc>
@@ -704,7 +764,7 @@
             <w:pPr>
               <w:jc w:val="right"/>
               <w:rPr>
-                <w:rFonts w:cs="B Yekan" w:hint="cs"/>
+                <w:rFonts w:cs="B Yekan"/>
                 <w:sz w:val="20"/>
                 <w:szCs w:val="20"/>
                 <w:rtl/>
@@ -732,7 +792,7 @@
             <w:pPr>
               <w:jc w:val="center"/>
               <w:rPr>
-                <w:rFonts w:cs="B Yekan" w:hint="cs"/>
+                <w:rFonts w:cs="B Yekan"/>
                 <w:sz w:val="20"/>
                 <w:szCs w:val="20"/>
                 <w:rtl/>
@@ -749,13 +809,33 @@
             <w:pPr>
               <w:jc w:val="right"/>
               <w:rPr>
+                <w:rFonts w:cs="B Yekan"/>
+                <w:sz w:val="20"/>
+                <w:szCs w:val="20"/>
+                <w:rtl/>
+                <w:lang w:bidi="fa-IR"/>
+              </w:rPr>
+            </w:pPr>
+            <w:r>
+              <w:rPr>
                 <w:rFonts w:cs="B Yekan" w:hint="cs"/>
                 <w:sz w:val="20"/>
                 <w:szCs w:val="20"/>
                 <w:rtl/>
                 <w:lang w:bidi="fa-IR"/>
               </w:rPr>
-            </w:pPr>
+              <w:t xml:space="preserve">آزمایشگاه مدار های منطقی </w:t>
+            </w:r>
+            <w:r>
+              <w:rPr>
+                <w:rFonts w:ascii="Arial" w:hAnsi="Arial" w:cs="Arial" w:hint="cs"/>
+                <w:sz w:val="20"/>
+                <w:szCs w:val="20"/>
+                <w:rtl/>
+                <w:lang w:bidi="fa-IR"/>
+              </w:rPr>
+              <w:t>–</w:t>
+            </w:r>
             <w:r>
               <w:rPr>
                 <w:rFonts w:cs="B Yekan" w:hint="cs"/>
@@ -764,17 +844,7 @@
                 <w:rtl/>
                 <w:lang w:bidi="fa-IR"/>
               </w:rPr>
-              <w:t xml:space="preserve">آزمایشگاه مدار های منطقی </w:t>
-            </w:r>
-            <w:r>
-              <w:rPr>
-                <w:rFonts w:ascii="Arial" w:hAnsi="Arial" w:cs="Arial" w:hint="cs"/>
-                <w:sz w:val="20"/>
-                <w:szCs w:val="20"/>
-                <w:rtl/>
-                <w:lang w:bidi="fa-IR"/>
-              </w:rPr>
-              <w:t>–</w:t>
+              <w:t xml:space="preserve"> گروه شماره </w:t>
             </w:r>
             <w:r>
               <w:rPr>
@@ -784,7 +854,7 @@
                 <w:rtl/>
                 <w:lang w:bidi="fa-IR"/>
               </w:rPr>
-              <w:t xml:space="preserve"> گروه شماره 2</w:t>
+              <w:t>7</w:t>
             </w:r>
           </w:p>
         </w:tc>
@@ -831,7 +901,7 @@
             <w:pPr>
               <w:jc w:val="right"/>
               <w:rPr>
-                <w:rFonts w:cs="B Yekan" w:hint="cs"/>
+                <w:rFonts w:cs="B Yekan"/>
                 <w:sz w:val="20"/>
                 <w:szCs w:val="20"/>
                 <w:rtl/>
@@ -859,7 +929,7 @@
             <w:pPr>
               <w:jc w:val="center"/>
               <w:rPr>
-                <w:rFonts w:cs="B Yekan" w:hint="cs"/>
+                <w:rFonts w:cs="B Yekan"/>
                 <w:sz w:val="20"/>
                 <w:szCs w:val="20"/>
                 <w:rtl/>
@@ -876,13 +946,33 @@
             <w:pPr>
               <w:jc w:val="right"/>
               <w:rPr>
+                <w:rFonts w:cs="B Yekan"/>
+                <w:sz w:val="20"/>
+                <w:szCs w:val="20"/>
+                <w:rtl/>
+                <w:lang w:bidi="fa-IR"/>
+              </w:rPr>
+            </w:pPr>
+            <w:r>
+              <w:rPr>
                 <w:rFonts w:cs="B Yekan" w:hint="cs"/>
                 <w:sz w:val="20"/>
                 <w:szCs w:val="20"/>
                 <w:rtl/>
                 <w:lang w:bidi="fa-IR"/>
               </w:rPr>
-            </w:pPr>
+              <w:t xml:space="preserve">آزمایشگاه مدار های منطقی </w:t>
+            </w:r>
+            <w:r>
+              <w:rPr>
+                <w:rFonts w:ascii="Arial" w:hAnsi="Arial" w:cs="Arial" w:hint="cs"/>
+                <w:sz w:val="20"/>
+                <w:szCs w:val="20"/>
+                <w:rtl/>
+                <w:lang w:bidi="fa-IR"/>
+              </w:rPr>
+              <w:t>–</w:t>
+            </w:r>
             <w:r>
               <w:rPr>
                 <w:rFonts w:cs="B Yekan" w:hint="cs"/>
@@ -891,17 +981,7 @@
                 <w:rtl/>
                 <w:lang w:bidi="fa-IR"/>
               </w:rPr>
-              <w:t xml:space="preserve">آزمایشگاه مدار های منطقی </w:t>
-            </w:r>
-            <w:r>
-              <w:rPr>
-                <w:rFonts w:ascii="Arial" w:hAnsi="Arial" w:cs="Arial" w:hint="cs"/>
-                <w:sz w:val="20"/>
-                <w:szCs w:val="20"/>
-                <w:rtl/>
-                <w:lang w:bidi="fa-IR"/>
-              </w:rPr>
-              <w:t>–</w:t>
+              <w:t xml:space="preserve"> گروه شماره </w:t>
             </w:r>
             <w:r>
               <w:rPr>
@@ -911,7 +991,7 @@
                 <w:rtl/>
                 <w:lang w:bidi="fa-IR"/>
               </w:rPr>
-              <w:t xml:space="preserve"> گروه شماره 2</w:t>
+              <w:t>7</w:t>
             </w:r>
           </w:p>
         </w:tc>
@@ -919,15 +999,2625 @@
     </w:tbl>
     <w:p>
       <w:pPr>
+        <w:bidi/>
+        <w:rPr>
+          <w:rFonts w:cs="B Yekan"/>
+          <w:rtl/>
+          <w:lang w:bidi="fa-IR"/>
+        </w:rPr>
+      </w:pPr>
+      <w:r>
+        <w:rPr>
+          <w:rFonts w:cs="B Yekan" w:hint="cs"/>
+          <w:b/>
+          <w:bCs/>
+          <w:rtl/>
+          <w:lang w:bidi="fa-IR"/>
+        </w:rPr>
+        <w:t xml:space="preserve">آزمایش سوم: </w:t>
+      </w:r>
+      <w:r>
+        <w:rPr>
+          <w:rFonts w:cs="B Yekan" w:hint="cs"/>
+          <w:rtl/>
+          <w:lang w:bidi="fa-IR"/>
+        </w:rPr>
+        <w:t xml:space="preserve">طراحی مدار </w:t>
+      </w:r>
+      <w:r>
+        <w:rPr>
+          <w:rFonts w:cs="B Yekan"/>
+          <w:lang w:bidi="fa-IR"/>
+        </w:rPr>
+        <w:t>carry-look-ahead</w:t>
+      </w:r>
+      <w:r>
+        <w:rPr>
+          <w:rFonts w:cs="B Yekan" w:hint="cs"/>
+          <w:rtl/>
+          <w:lang w:bidi="fa-IR"/>
+        </w:rPr>
+        <w:t xml:space="preserve"> با نرم افزار پروتئوس.</w:t>
+      </w:r>
+    </w:p>
+    <w:p>
+      <w:pPr>
+        <w:bidi/>
+        <w:rPr>
+          <w:rFonts w:cs="B Yekan"/>
+          <w:rtl/>
+          <w:lang w:bidi="fa-IR"/>
+        </w:rPr>
+      </w:pPr>
+    </w:p>
+    <w:p>
+      <w:pPr>
+        <w:bidi/>
+        <w:rPr>
+          <w:rFonts w:eastAsiaTheme="minorEastAsia" w:cs="B Yekan"/>
+          <w:lang w:bidi="fa-IR"/>
+        </w:rPr>
+      </w:pPr>
+      <w:r>
+        <w:rPr>
+          <w:rFonts w:cs="B Yekan" w:hint="cs"/>
+          <w:rtl/>
+          <w:lang w:bidi="fa-IR"/>
+        </w:rPr>
+        <w:t>میخواهیم</w:t>
+      </w:r>
+      <w:r>
+        <w:rPr>
+          <w:rFonts w:cs="B Yekan"/>
+          <w:lang w:bidi="fa-IR"/>
+        </w:rPr>
+        <w:t xml:space="preserve">  </w:t>
+      </w:r>
+      <w:r>
+        <w:rPr>
+          <w:rFonts w:cs="B Yekan" w:hint="cs"/>
+          <w:rtl/>
+          <w:lang w:bidi="fa-IR"/>
+        </w:rPr>
+        <w:t xml:space="preserve"> یک جمع کنندی چهاربیتی بسازیم که با حساب کردن بیت </w:t>
+      </w:r>
+      <w:r>
+        <w:rPr>
+          <w:rFonts w:cs="B Yekan"/>
+          <w:lang w:bidi="fa-IR"/>
+        </w:rPr>
+        <w:t>carry</w:t>
+      </w:r>
+      <w:r>
+        <w:rPr>
+          <w:rFonts w:cs="B Yekan" w:hint="cs"/>
+          <w:rtl/>
+          <w:lang w:bidi="fa-IR"/>
+        </w:rPr>
+        <w:t xml:space="preserve"> سریع تر از جمع کننده قبلی کار کند. میخواهیم اعداد </w:t>
+      </w:r>
+      <m:oMath>
+        <m:acc>
+          <m:accPr>
+            <m:chr m:val="̅"/>
+            <m:ctrlPr>
+              <w:rPr>
+                <w:rFonts w:ascii="Cambria Math" w:hAnsi="Cambria Math" w:cs="B Yekan"/>
+                <w:i/>
+                <w:lang w:bidi="fa-IR"/>
+              </w:rPr>
+            </m:ctrlPr>
+          </m:accPr>
+          <m:e>
+            <m:sSub>
+              <m:sSubPr>
+                <m:ctrlPr>
+                  <w:rPr>
+                    <w:rFonts w:ascii="Cambria Math" w:hAnsi="Cambria Math" w:cs="B Yekan"/>
+                    <w:i/>
+                    <w:lang w:bidi="fa-IR"/>
+                  </w:rPr>
+                </m:ctrlPr>
+              </m:sSubPr>
+              <m:e>
+                <m:r>
+                  <w:rPr>
+                    <w:rFonts w:ascii="Cambria Math" w:hAnsi="Cambria Math" w:cs="B Yekan"/>
+                    <w:lang w:bidi="fa-IR"/>
+                  </w:rPr>
+                  <m:t>A</m:t>
+                </m:r>
+              </m:e>
+              <m:sub>
+                <m:r>
+                  <w:rPr>
+                    <w:rFonts w:ascii="Cambria Math" w:hAnsi="Cambria Math" w:cs="B Yekan"/>
+                    <w:lang w:bidi="fa-IR"/>
+                  </w:rPr>
+                  <m:t>3</m:t>
+                </m:r>
+              </m:sub>
+            </m:sSub>
+            <m:sSub>
+              <m:sSubPr>
+                <m:ctrlPr>
+                  <w:rPr>
+                    <w:rFonts w:ascii="Cambria Math" w:hAnsi="Cambria Math" w:cs="B Yekan"/>
+                    <w:i/>
+                    <w:lang w:bidi="fa-IR"/>
+                  </w:rPr>
+                </m:ctrlPr>
+              </m:sSubPr>
+              <m:e>
+                <m:r>
+                  <w:rPr>
+                    <w:rFonts w:ascii="Cambria Math" w:hAnsi="Cambria Math" w:cs="B Yekan"/>
+                    <w:lang w:bidi="fa-IR"/>
+                  </w:rPr>
+                  <m:t>A</m:t>
+                </m:r>
+              </m:e>
+              <m:sub>
+                <m:r>
+                  <w:rPr>
+                    <w:rFonts w:ascii="Cambria Math" w:hAnsi="Cambria Math" w:cs="B Yekan"/>
+                    <w:lang w:bidi="fa-IR"/>
+                  </w:rPr>
+                  <m:t>2</m:t>
+                </m:r>
+              </m:sub>
+            </m:sSub>
+            <m:sSub>
+              <m:sSubPr>
+                <m:ctrlPr>
+                  <w:rPr>
+                    <w:rFonts w:ascii="Cambria Math" w:hAnsi="Cambria Math" w:cs="B Yekan"/>
+                    <w:i/>
+                    <w:lang w:bidi="fa-IR"/>
+                  </w:rPr>
+                </m:ctrlPr>
+              </m:sSubPr>
+              <m:e>
+                <m:r>
+                  <w:rPr>
+                    <w:rFonts w:ascii="Cambria Math" w:hAnsi="Cambria Math" w:cs="B Yekan"/>
+                    <w:lang w:bidi="fa-IR"/>
+                  </w:rPr>
+                  <m:t>A</m:t>
+                </m:r>
+              </m:e>
+              <m:sub>
+                <m:r>
+                  <w:rPr>
+                    <w:rFonts w:ascii="Cambria Math" w:hAnsi="Cambria Math" w:cs="B Yekan"/>
+                    <w:lang w:bidi="fa-IR"/>
+                  </w:rPr>
+                  <m:t>1</m:t>
+                </m:r>
+              </m:sub>
+            </m:sSub>
+            <m:sSub>
+              <m:sSubPr>
+                <m:ctrlPr>
+                  <w:rPr>
+                    <w:rFonts w:ascii="Cambria Math" w:hAnsi="Cambria Math" w:cs="B Yekan"/>
+                    <w:i/>
+                    <w:lang w:bidi="fa-IR"/>
+                  </w:rPr>
+                </m:ctrlPr>
+              </m:sSubPr>
+              <m:e>
+                <m:r>
+                  <w:rPr>
+                    <w:rFonts w:ascii="Cambria Math" w:hAnsi="Cambria Math" w:cs="B Yekan"/>
+                    <w:lang w:bidi="fa-IR"/>
+                  </w:rPr>
+                  <m:t>A</m:t>
+                </m:r>
+              </m:e>
+              <m:sub>
+                <m:r>
+                  <w:rPr>
+                    <w:rFonts w:ascii="Cambria Math" w:hAnsi="Cambria Math" w:cs="B Yekan"/>
+                    <w:lang w:bidi="fa-IR"/>
+                  </w:rPr>
+                  <m:t>0</m:t>
+                </m:r>
+              </m:sub>
+            </m:sSub>
+          </m:e>
+        </m:acc>
+      </m:oMath>
+      <w:r>
+        <w:rPr>
+          <w:rFonts w:eastAsiaTheme="minorEastAsia" w:cs="B Yekan"/>
+          <w:lang w:bidi="fa-IR"/>
+        </w:rPr>
+        <w:t xml:space="preserve"> </w:t>
+      </w:r>
+      <w:r>
+        <w:rPr>
+          <w:rFonts w:eastAsiaTheme="minorEastAsia" w:cs="B Yekan" w:hint="cs"/>
+          <w:rtl/>
+          <w:lang w:bidi="fa-IR"/>
+        </w:rPr>
+        <w:t xml:space="preserve"> و </w:t>
+      </w:r>
+      <m:oMath>
+        <m:acc>
+          <m:accPr>
+            <m:chr m:val="̅"/>
+            <m:ctrlPr>
+              <w:rPr>
+                <w:rFonts w:ascii="Cambria Math" w:eastAsiaTheme="minorEastAsia" w:hAnsi="Cambria Math" w:cs="B Yekan"/>
+                <w:i/>
+                <w:lang w:bidi="fa-IR"/>
+              </w:rPr>
+            </m:ctrlPr>
+          </m:accPr>
+          <m:e>
+            <m:sSub>
+              <m:sSubPr>
+                <m:ctrlPr>
+                  <w:rPr>
+                    <w:rFonts w:ascii="Cambria Math" w:eastAsiaTheme="minorEastAsia" w:hAnsi="Cambria Math" w:cs="B Yekan"/>
+                    <w:i/>
+                    <w:lang w:bidi="fa-IR"/>
+                  </w:rPr>
+                </m:ctrlPr>
+              </m:sSubPr>
+              <m:e>
+                <m:r>
+                  <w:rPr>
+                    <w:rFonts w:ascii="Cambria Math" w:eastAsiaTheme="minorEastAsia" w:hAnsi="Cambria Math" w:cs="B Yekan"/>
+                    <w:lang w:bidi="fa-IR"/>
+                  </w:rPr>
+                  <m:t>B</m:t>
+                </m:r>
+              </m:e>
+              <m:sub>
+                <m:r>
+                  <w:rPr>
+                    <w:rFonts w:ascii="Cambria Math" w:eastAsiaTheme="minorEastAsia" w:hAnsi="Cambria Math" w:cs="B Yekan"/>
+                    <w:lang w:bidi="fa-IR"/>
+                  </w:rPr>
+                  <m:t>3</m:t>
+                </m:r>
+              </m:sub>
+            </m:sSub>
+            <m:sSub>
+              <m:sSubPr>
+                <m:ctrlPr>
+                  <w:rPr>
+                    <w:rFonts w:ascii="Cambria Math" w:eastAsiaTheme="minorEastAsia" w:hAnsi="Cambria Math" w:cs="B Yekan"/>
+                    <w:i/>
+                    <w:lang w:bidi="fa-IR"/>
+                  </w:rPr>
+                </m:ctrlPr>
+              </m:sSubPr>
+              <m:e>
+                <m:r>
+                  <w:rPr>
+                    <w:rFonts w:ascii="Cambria Math" w:eastAsiaTheme="minorEastAsia" w:hAnsi="Cambria Math" w:cs="B Yekan"/>
+                    <w:lang w:bidi="fa-IR"/>
+                  </w:rPr>
+                  <m:t>B</m:t>
+                </m:r>
+              </m:e>
+              <m:sub>
+                <m:r>
+                  <w:rPr>
+                    <w:rFonts w:ascii="Cambria Math" w:eastAsiaTheme="minorEastAsia" w:hAnsi="Cambria Math" w:cs="B Yekan"/>
+                    <w:lang w:bidi="fa-IR"/>
+                  </w:rPr>
+                  <m:t>2</m:t>
+                </m:r>
+              </m:sub>
+            </m:sSub>
+            <m:sSub>
+              <m:sSubPr>
+                <m:ctrlPr>
+                  <w:rPr>
+                    <w:rFonts w:ascii="Cambria Math" w:eastAsiaTheme="minorEastAsia" w:hAnsi="Cambria Math" w:cs="B Yekan"/>
+                    <w:i/>
+                    <w:lang w:bidi="fa-IR"/>
+                  </w:rPr>
+                </m:ctrlPr>
+              </m:sSubPr>
+              <m:e>
+                <m:r>
+                  <w:rPr>
+                    <w:rFonts w:ascii="Cambria Math" w:eastAsiaTheme="minorEastAsia" w:hAnsi="Cambria Math" w:cs="B Yekan"/>
+                    <w:lang w:bidi="fa-IR"/>
+                  </w:rPr>
+                  <m:t>B</m:t>
+                </m:r>
+              </m:e>
+              <m:sub>
+                <m:r>
+                  <w:rPr>
+                    <w:rFonts w:ascii="Cambria Math" w:eastAsiaTheme="minorEastAsia" w:hAnsi="Cambria Math" w:cs="B Yekan"/>
+                    <w:lang w:bidi="fa-IR"/>
+                  </w:rPr>
+                  <m:t>1</m:t>
+                </m:r>
+              </m:sub>
+            </m:sSub>
+            <m:sSub>
+              <m:sSubPr>
+                <m:ctrlPr>
+                  <w:rPr>
+                    <w:rFonts w:ascii="Cambria Math" w:eastAsiaTheme="minorEastAsia" w:hAnsi="Cambria Math" w:cs="B Yekan"/>
+                    <w:i/>
+                    <w:lang w:bidi="fa-IR"/>
+                  </w:rPr>
+                </m:ctrlPr>
+              </m:sSubPr>
+              <m:e>
+                <m:r>
+                  <w:rPr>
+                    <w:rFonts w:ascii="Cambria Math" w:eastAsiaTheme="minorEastAsia" w:hAnsi="Cambria Math" w:cs="B Yekan"/>
+                    <w:lang w:bidi="fa-IR"/>
+                  </w:rPr>
+                  <m:t>B</m:t>
+                </m:r>
+              </m:e>
+              <m:sub>
+                <m:r>
+                  <w:rPr>
+                    <w:rFonts w:ascii="Cambria Math" w:eastAsiaTheme="minorEastAsia" w:hAnsi="Cambria Math" w:cs="B Yekan"/>
+                    <w:lang w:bidi="fa-IR"/>
+                  </w:rPr>
+                  <m:t>0</m:t>
+                </m:r>
+              </m:sub>
+            </m:sSub>
+          </m:e>
+        </m:acc>
+      </m:oMath>
+      <w:r>
+        <w:rPr>
+          <w:rFonts w:eastAsiaTheme="minorEastAsia" w:cs="B Yekan"/>
+          <w:lang w:bidi="fa-IR"/>
+        </w:rPr>
+        <w:t xml:space="preserve"> </w:t>
+      </w:r>
+      <w:r>
+        <w:rPr>
+          <w:rFonts w:eastAsiaTheme="minorEastAsia" w:cs="B Yekan" w:hint="cs"/>
+          <w:rtl/>
+          <w:lang w:bidi="fa-IR"/>
+        </w:rPr>
+        <w:t xml:space="preserve"> را با </w:t>
+      </w:r>
+      <w:r>
+        <w:rPr>
+          <w:rFonts w:eastAsiaTheme="minorEastAsia" w:cs="B Yekan"/>
+          <w:lang w:bidi="fa-IR"/>
+        </w:rPr>
+        <w:t>carry</w:t>
+      </w:r>
+      <w:r>
+        <w:rPr>
+          <w:rFonts w:eastAsiaTheme="minorEastAsia" w:cs="B Yekan" w:hint="cs"/>
+          <w:rtl/>
+          <w:lang w:bidi="fa-IR"/>
+        </w:rPr>
+        <w:t xml:space="preserve"> ورودی </w:t>
+      </w:r>
+      <m:oMath>
+        <m:sSub>
+          <m:sSubPr>
+            <m:ctrlPr>
+              <w:rPr>
+                <w:rFonts w:ascii="Cambria Math" w:eastAsiaTheme="minorEastAsia" w:hAnsi="Cambria Math" w:cs="B Yekan"/>
+                <w:i/>
+                <w:lang w:bidi="fa-IR"/>
+              </w:rPr>
+            </m:ctrlPr>
+          </m:sSubPr>
+          <m:e>
+            <m:r>
+              <w:rPr>
+                <w:rFonts w:ascii="Cambria Math" w:eastAsiaTheme="minorEastAsia" w:hAnsi="Cambria Math" w:cs="B Yekan"/>
+                <w:lang w:bidi="fa-IR"/>
+              </w:rPr>
+              <m:t>C</m:t>
+            </m:r>
+          </m:e>
+          <m:sub>
+            <m:r>
+              <w:rPr>
+                <w:rFonts w:ascii="Cambria Math" w:eastAsiaTheme="minorEastAsia" w:hAnsi="Cambria Math" w:cs="B Yekan"/>
+                <w:lang w:bidi="fa-IR"/>
+              </w:rPr>
+              <m:t>0</m:t>
+            </m:r>
+          </m:sub>
+        </m:sSub>
+      </m:oMath>
+      <w:r>
+        <w:rPr>
+          <w:rFonts w:eastAsiaTheme="minorEastAsia" w:cs="B Yekan"/>
+          <w:lang w:bidi="fa-IR"/>
+        </w:rPr>
+        <w:t xml:space="preserve"> </w:t>
+      </w:r>
+      <w:r>
+        <w:rPr>
+          <w:rFonts w:eastAsiaTheme="minorEastAsia" w:cs="B Yekan" w:hint="cs"/>
+          <w:rtl/>
+          <w:lang w:bidi="fa-IR"/>
+        </w:rPr>
+        <w:t xml:space="preserve"> جمع کنیم.</w:t>
+      </w:r>
+    </w:p>
+    <w:p>
+      <w:pPr>
+        <w:bidi/>
+        <w:rPr>
+          <w:rFonts w:eastAsiaTheme="minorEastAsia" w:cs="B Yekan"/>
+          <w:rtl/>
+          <w:lang w:bidi="fa-IR"/>
+        </w:rPr>
+      </w:pPr>
+      <w:r>
+        <w:rPr>
+          <w:rFonts w:eastAsiaTheme="minorEastAsia" w:cs="B Yekan" w:hint="cs"/>
+          <w:rtl/>
+          <w:lang w:bidi="fa-IR"/>
+        </w:rPr>
+        <w:t xml:space="preserve"> ورودی مدار </w:t>
+      </w:r>
+      <w:r>
+        <w:rPr>
+          <w:rFonts w:eastAsiaTheme="minorEastAsia" w:cs="B Yekan"/>
+          <w:lang w:bidi="fa-IR"/>
+        </w:rPr>
+        <w:t>carry lookahead</w:t>
+      </w:r>
+      <w:r>
+        <w:rPr>
+          <w:rFonts w:eastAsiaTheme="minorEastAsia" w:cs="B Yekan" w:hint="cs"/>
+          <w:rtl/>
+          <w:lang w:bidi="fa-IR"/>
+        </w:rPr>
+        <w:t xml:space="preserve"> این گونه است:</w:t>
+      </w:r>
+    </w:p>
+    <w:p>
+      <w:pPr>
+        <w:bidi/>
+        <w:jc w:val="right"/>
+        <w:rPr>
+          <w:rFonts w:eastAsiaTheme="minorEastAsia" w:cs="B Yekan"/>
+          <w:lang w:bidi="fa-IR"/>
+        </w:rPr>
+      </w:pPr>
+      <m:oMathPara>
+        <m:oMathParaPr>
+          <m:jc m:val="left"/>
+        </m:oMathParaPr>
+        <m:oMath>
+          <m:sSub>
+            <m:sSubPr>
+              <m:ctrlPr>
+                <w:rPr>
+                  <w:rFonts w:ascii="Cambria Math" w:hAnsi="Cambria Math" w:cs="B Yekan"/>
+                  <w:i/>
+                  <w:lang w:bidi="fa-IR"/>
+                </w:rPr>
+              </m:ctrlPr>
+            </m:sSubPr>
+            <m:e>
+              <m:r>
+                <w:rPr>
+                  <w:rFonts w:ascii="Cambria Math" w:hAnsi="Cambria Math" w:cs="B Yekan"/>
+                  <w:lang w:bidi="fa-IR"/>
+                </w:rPr>
+                <m:t>P</m:t>
+              </m:r>
+            </m:e>
+            <m:sub>
+              <m:r>
+                <w:rPr>
+                  <w:rFonts w:ascii="Cambria Math" w:hAnsi="Cambria Math" w:cs="B Yekan"/>
+                  <w:lang w:bidi="fa-IR"/>
+                </w:rPr>
+                <m:t>i</m:t>
+              </m:r>
+            </m:sub>
+          </m:sSub>
+          <m:r>
+            <w:rPr>
+              <w:rFonts w:ascii="Cambria Math" w:hAnsi="Cambria Math" w:cs="B Yekan"/>
+              <w:lang w:bidi="fa-IR"/>
+            </w:rPr>
+            <m:t>​=</m:t>
+          </m:r>
+          <m:sSub>
+            <m:sSubPr>
+              <m:ctrlPr>
+                <w:rPr>
+                  <w:rFonts w:ascii="Cambria Math" w:hAnsi="Cambria Math" w:cs="B Yekan"/>
+                  <w:i/>
+                  <w:lang w:bidi="fa-IR"/>
+                </w:rPr>
+              </m:ctrlPr>
+            </m:sSubPr>
+            <m:e>
+              <m:r>
+                <w:rPr>
+                  <w:rFonts w:ascii="Cambria Math" w:hAnsi="Cambria Math" w:cs="B Yekan"/>
+                  <w:lang w:bidi="fa-IR"/>
+                </w:rPr>
+                <m:t>A</m:t>
+              </m:r>
+            </m:e>
+            <m:sub>
+              <m:r>
+                <w:rPr>
+                  <w:rFonts w:ascii="Cambria Math" w:hAnsi="Cambria Math" w:cs="B Yekan"/>
+                  <w:lang w:bidi="fa-IR"/>
+                </w:rPr>
+                <m:t>i</m:t>
+              </m:r>
+            </m:sub>
+          </m:sSub>
+          <m:r>
+            <w:rPr>
+              <w:rFonts w:ascii="Cambria Math" w:hAnsi="Cambria Math" w:cs="B Yekan"/>
+              <w:lang w:bidi="fa-IR"/>
+            </w:rPr>
+            <m:t>​⊕</m:t>
+          </m:r>
+          <m:sSub>
+            <m:sSubPr>
+              <m:ctrlPr>
+                <w:rPr>
+                  <w:rFonts w:ascii="Cambria Math" w:hAnsi="Cambria Math" w:cs="B Yekan"/>
+                  <w:i/>
+                  <w:lang w:bidi="fa-IR"/>
+                </w:rPr>
+              </m:ctrlPr>
+            </m:sSubPr>
+            <m:e>
+              <m:r>
+                <w:rPr>
+                  <w:rFonts w:ascii="Cambria Math" w:hAnsi="Cambria Math" w:cs="B Yekan"/>
+                  <w:lang w:bidi="fa-IR"/>
+                </w:rPr>
+                <m:t>B</m:t>
+              </m:r>
+            </m:e>
+            <m:sub>
+              <m:r>
+                <w:rPr>
+                  <w:rFonts w:ascii="Cambria Math" w:hAnsi="Cambria Math" w:cs="B Yekan"/>
+                  <w:lang w:bidi="fa-IR"/>
+                </w:rPr>
+                <m:t>i</m:t>
+              </m:r>
+            </m:sub>
+          </m:sSub>
+        </m:oMath>
+      </m:oMathPara>
+    </w:p>
+    <w:p>
+      <w:pPr>
+        <w:bidi/>
+        <w:jc w:val="right"/>
+        <w:rPr>
+          <w:rFonts w:eastAsiaTheme="minorEastAsia" w:cs="B Yekan"/>
+          <w:lang w:bidi="fa-IR"/>
+        </w:rPr>
+      </w:pPr>
+      <m:oMathPara>
+        <m:oMathParaPr>
+          <m:jc m:val="left"/>
+        </m:oMathParaPr>
+        <m:oMath>
+          <m:sSub>
+            <m:sSubPr>
+              <m:ctrlPr>
+                <w:rPr>
+                  <w:rFonts w:ascii="Cambria Math" w:hAnsi="Cambria Math" w:cs="B Yekan"/>
+                  <w:i/>
+                  <w:lang w:bidi="fa-IR"/>
+                </w:rPr>
+              </m:ctrlPr>
+            </m:sSubPr>
+            <m:e>
+              <m:r>
+                <w:rPr>
+                  <w:rFonts w:ascii="Cambria Math" w:hAnsi="Cambria Math" w:cs="B Yekan"/>
+                  <w:lang w:bidi="fa-IR"/>
+                </w:rPr>
+                <m:t>G</m:t>
+              </m:r>
+            </m:e>
+            <m:sub>
+              <m:r>
+                <w:rPr>
+                  <w:rFonts w:ascii="Cambria Math" w:hAnsi="Cambria Math" w:cs="B Yekan"/>
+                  <w:lang w:bidi="fa-IR"/>
+                </w:rPr>
+                <m:t>i</m:t>
+              </m:r>
+            </m:sub>
+          </m:sSub>
+          <m:r>
+            <w:rPr>
+              <w:rFonts w:ascii="Cambria Math" w:hAnsi="Cambria Math" w:cs="B Yekan"/>
+              <w:lang w:bidi="fa-IR"/>
+            </w:rPr>
+            <m:t>=</m:t>
+          </m:r>
+          <m:sSub>
+            <m:sSubPr>
+              <m:ctrlPr>
+                <w:rPr>
+                  <w:rFonts w:ascii="Cambria Math" w:hAnsi="Cambria Math" w:cs="B Yekan"/>
+                  <w:i/>
+                  <w:lang w:bidi="fa-IR"/>
+                </w:rPr>
+              </m:ctrlPr>
+            </m:sSubPr>
+            <m:e>
+              <m:r>
+                <w:rPr>
+                  <w:rFonts w:ascii="Cambria Math" w:hAnsi="Cambria Math" w:cs="B Yekan"/>
+                  <w:lang w:bidi="fa-IR"/>
+                </w:rPr>
+                <m:t>A</m:t>
+              </m:r>
+            </m:e>
+            <m:sub>
+              <m:r>
+                <w:rPr>
+                  <w:rFonts w:ascii="Cambria Math" w:hAnsi="Cambria Math" w:cs="B Yekan"/>
+                  <w:lang w:bidi="fa-IR"/>
+                </w:rPr>
+                <m:t>i</m:t>
+              </m:r>
+            </m:sub>
+          </m:sSub>
+          <m:sSub>
+            <m:sSubPr>
+              <m:ctrlPr>
+                <w:rPr>
+                  <w:rFonts w:ascii="Cambria Math" w:hAnsi="Cambria Math" w:cs="B Yekan"/>
+                  <w:i/>
+                  <w:lang w:bidi="fa-IR"/>
+                </w:rPr>
+              </m:ctrlPr>
+            </m:sSubPr>
+            <m:e>
+              <m:r>
+                <w:rPr>
+                  <w:rFonts w:ascii="Cambria Math" w:hAnsi="Cambria Math" w:cs="B Yekan"/>
+                  <w:lang w:bidi="fa-IR"/>
+                </w:rPr>
+                <m:t>B</m:t>
+              </m:r>
+            </m:e>
+            <m:sub>
+              <m:r>
+                <w:rPr>
+                  <w:rFonts w:ascii="Cambria Math" w:hAnsi="Cambria Math" w:cs="B Yekan"/>
+                  <w:lang w:bidi="fa-IR"/>
+                </w:rPr>
+                <m:t>i</m:t>
+              </m:r>
+            </m:sub>
+          </m:sSub>
+        </m:oMath>
+      </m:oMathPara>
+    </w:p>
+    <w:p>
+      <w:pPr>
+        <w:bidi/>
+        <w:rPr>
+          <w:rFonts w:cs="B Yekan"/>
+          <w:rtl/>
+          <w:lang w:bidi="fa-IR"/>
+        </w:rPr>
+      </w:pPr>
+      <w:r>
+        <w:rPr>
+          <w:rFonts w:cs="B Yekan" w:hint="cs"/>
+          <w:rtl/>
+          <w:lang w:bidi="fa-IR"/>
+        </w:rPr>
+        <w:t>و طبق رابطه‌ جمع معادله بازگشتی زیر را داریم:</w:t>
+      </w:r>
+    </w:p>
+    <w:p>
+      <w:pPr>
+        <w:bidi/>
+        <w:jc w:val="right"/>
+        <w:rPr>
+          <w:rFonts w:eastAsiaTheme="minorEastAsia" w:cs="B Yekan"/>
+          <w:rtl/>
+          <w:lang w:bidi="fa-IR"/>
+        </w:rPr>
+      </w:pPr>
+      <m:oMathPara>
+        <m:oMathParaPr>
+          <m:jc m:val="left"/>
+        </m:oMathParaPr>
+        <m:oMath>
+          <m:sSub>
+            <m:sSubPr>
+              <m:ctrlPr>
+                <w:rPr>
+                  <w:rFonts w:ascii="Cambria Math" w:hAnsi="Cambria Math" w:cs="B Yekan"/>
+                  <w:i/>
+                  <w:lang w:bidi="fa-IR"/>
+                </w:rPr>
+              </m:ctrlPr>
+            </m:sSubPr>
+            <m:e>
+              <m:r>
+                <w:rPr>
+                  <w:rFonts w:ascii="Cambria Math" w:hAnsi="Cambria Math" w:cs="B Yekan"/>
+                  <w:lang w:bidi="fa-IR"/>
+                </w:rPr>
+                <m:t>C</m:t>
+              </m:r>
+            </m:e>
+            <m:sub>
+              <m:r>
+                <w:rPr>
+                  <w:rFonts w:ascii="Cambria Math" w:hAnsi="Cambria Math" w:cs="B Yekan"/>
+                  <w:lang w:bidi="fa-IR"/>
+                </w:rPr>
+                <m:t>i+1</m:t>
+              </m:r>
+            </m:sub>
+          </m:sSub>
+          <m:r>
+            <w:rPr>
+              <w:rFonts w:ascii="Cambria Math" w:hAnsi="Cambria Math" w:cs="B Yekan"/>
+              <w:lang w:bidi="fa-IR"/>
+            </w:rPr>
+            <m:t>=</m:t>
+          </m:r>
+          <m:sSub>
+            <m:sSubPr>
+              <m:ctrlPr>
+                <w:rPr>
+                  <w:rFonts w:ascii="Cambria Math" w:hAnsi="Cambria Math" w:cs="B Yekan"/>
+                  <w:i/>
+                  <w:lang w:bidi="fa-IR"/>
+                </w:rPr>
+              </m:ctrlPr>
+            </m:sSubPr>
+            <m:e>
+              <m:r>
+                <w:rPr>
+                  <w:rFonts w:ascii="Cambria Math" w:hAnsi="Cambria Math" w:cs="B Yekan"/>
+                  <w:lang w:bidi="fa-IR"/>
+                </w:rPr>
+                <m:t>G</m:t>
+              </m:r>
+            </m:e>
+            <m:sub>
+              <m:r>
+                <w:rPr>
+                  <w:rFonts w:ascii="Cambria Math" w:hAnsi="Cambria Math" w:cs="B Yekan"/>
+                  <w:lang w:bidi="fa-IR"/>
+                </w:rPr>
+                <m:t>i</m:t>
+              </m:r>
+            </m:sub>
+          </m:sSub>
+          <m:r>
+            <w:rPr>
+              <w:rFonts w:ascii="Cambria Math" w:hAnsi="Cambria Math" w:cs="B Yekan"/>
+              <w:lang w:bidi="fa-IR"/>
+            </w:rPr>
+            <m:t>+</m:t>
+          </m:r>
+          <m:sSub>
+            <m:sSubPr>
+              <m:ctrlPr>
+                <w:rPr>
+                  <w:rFonts w:ascii="Cambria Math" w:hAnsi="Cambria Math" w:cs="B Yekan"/>
+                  <w:i/>
+                  <w:lang w:bidi="fa-IR"/>
+                </w:rPr>
+              </m:ctrlPr>
+            </m:sSubPr>
+            <m:e>
+              <m:r>
+                <w:rPr>
+                  <w:rFonts w:ascii="Cambria Math" w:hAnsi="Cambria Math" w:cs="B Yekan"/>
+                  <w:lang w:bidi="fa-IR"/>
+                </w:rPr>
+                <m:t>P</m:t>
+              </m:r>
+            </m:e>
+            <m:sub>
+              <m:r>
+                <w:rPr>
+                  <w:rFonts w:ascii="Cambria Math" w:hAnsi="Cambria Math" w:cs="B Yekan"/>
+                  <w:lang w:bidi="fa-IR"/>
+                </w:rPr>
+                <m:t>i</m:t>
+              </m:r>
+            </m:sub>
+          </m:sSub>
+          <m:sSub>
+            <m:sSubPr>
+              <m:ctrlPr>
+                <w:rPr>
+                  <w:rFonts w:ascii="Cambria Math" w:hAnsi="Cambria Math" w:cs="B Yekan"/>
+                  <w:i/>
+                  <w:lang w:bidi="fa-IR"/>
+                </w:rPr>
+              </m:ctrlPr>
+            </m:sSubPr>
+            <m:e>
+              <m:r>
+                <w:rPr>
+                  <w:rFonts w:ascii="Cambria Math" w:hAnsi="Cambria Math" w:cs="B Yekan"/>
+                  <w:lang w:bidi="fa-IR"/>
+                </w:rPr>
+                <m:t>C</m:t>
+              </m:r>
+            </m:e>
+            <m:sub>
+              <m:r>
+                <w:rPr>
+                  <w:rFonts w:ascii="Cambria Math" w:hAnsi="Cambria Math" w:cs="B Yekan"/>
+                  <w:lang w:bidi="fa-IR"/>
+                </w:rPr>
+                <m:t>i</m:t>
+              </m:r>
+            </m:sub>
+          </m:sSub>
+        </m:oMath>
+      </m:oMathPara>
+    </w:p>
+    <w:p>
+      <w:pPr>
+        <w:bidi/>
+        <w:rPr>
+          <w:rFonts w:eastAsiaTheme="minorEastAsia" w:cs="B Yekan"/>
+          <w:rtl/>
+          <w:lang w:bidi="fa-IR"/>
+        </w:rPr>
+      </w:pPr>
+      <w:r>
+        <w:rPr>
+          <w:rFonts w:eastAsiaTheme="minorEastAsia" w:cs="B Yekan" w:hint="cs"/>
+          <w:rtl/>
+          <w:lang w:bidi="fa-IR"/>
+        </w:rPr>
+        <w:t>که با این رابطه</w:t>
+      </w:r>
+      <m:oMath>
+        <m:sSub>
+          <m:sSubPr>
+            <m:ctrlPr>
+              <w:rPr>
+                <w:rFonts w:ascii="Cambria Math" w:eastAsiaTheme="minorEastAsia" w:hAnsi="Cambria Math" w:cs="B Yekan"/>
+                <w:i/>
+                <w:lang w:bidi="fa-IR"/>
+              </w:rPr>
+            </m:ctrlPr>
+          </m:sSubPr>
+          <m:e>
+            <m:r>
+              <w:rPr>
+                <w:rFonts w:ascii="Cambria Math" w:eastAsiaTheme="minorEastAsia" w:hAnsi="Cambria Math" w:cs="B Yekan"/>
+                <w:lang w:bidi="fa-IR"/>
+              </w:rPr>
+              <m:t>C</m:t>
+            </m:r>
+          </m:e>
+          <m:sub>
+            <m:r>
+              <w:rPr>
+                <w:rFonts w:ascii="Cambria Math" w:eastAsiaTheme="minorEastAsia" w:hAnsi="Cambria Math" w:cs="B Yekan"/>
+                <w:lang w:bidi="fa-IR"/>
+              </w:rPr>
+              <m:t>1</m:t>
+            </m:r>
+          </m:sub>
+        </m:sSub>
+      </m:oMath>
+      <w:r>
+        <w:rPr>
+          <w:rFonts w:eastAsiaTheme="minorEastAsia" w:cs="B Yekan" w:hint="cs"/>
+          <w:rtl/>
+          <w:lang w:bidi="fa-IR"/>
+        </w:rPr>
+        <w:t xml:space="preserve"> تا </w:t>
+      </w:r>
+      <m:oMath>
+        <m:sSub>
+          <m:sSubPr>
+            <m:ctrlPr>
+              <w:rPr>
+                <w:rFonts w:ascii="Cambria Math" w:eastAsiaTheme="minorEastAsia" w:hAnsi="Cambria Math" w:cs="B Yekan"/>
+                <w:i/>
+                <w:lang w:bidi="fa-IR"/>
+              </w:rPr>
+            </m:ctrlPr>
+          </m:sSubPr>
+          <m:e>
+            <m:r>
+              <w:rPr>
+                <w:rFonts w:ascii="Cambria Math" w:eastAsiaTheme="minorEastAsia" w:hAnsi="Cambria Math" w:cs="B Yekan"/>
+                <w:lang w:bidi="fa-IR"/>
+              </w:rPr>
+              <m:t>C</m:t>
+            </m:r>
+          </m:e>
+          <m:sub>
+            <m:r>
+              <w:rPr>
+                <w:rFonts w:ascii="Cambria Math" w:eastAsiaTheme="minorEastAsia" w:hAnsi="Cambria Math" w:cs="B Yekan"/>
+                <w:lang w:bidi="fa-IR"/>
+              </w:rPr>
+              <m:t>4</m:t>
+            </m:r>
+          </m:sub>
+        </m:sSub>
+      </m:oMath>
+      <w:r>
+        <w:rPr>
+          <w:rFonts w:eastAsiaTheme="minorEastAsia" w:cs="B Yekan" w:hint="cs"/>
+          <w:rtl/>
+          <w:lang w:bidi="fa-IR"/>
+        </w:rPr>
+        <w:t xml:space="preserve"> به دست می‌آید.</w:t>
+      </w:r>
+    </w:p>
+    <w:p>
+      <w:pPr>
+        <w:bidi/>
+        <w:jc w:val="right"/>
+        <w:rPr>
+          <w:rFonts w:eastAsiaTheme="minorEastAsia" w:cs="B Yekan"/>
+          <w:rtl/>
+          <w:lang w:bidi="fa-IR"/>
+        </w:rPr>
+      </w:pPr>
+      <m:oMathPara>
+        <m:oMathParaPr>
+          <m:jc m:val="left"/>
+        </m:oMathParaPr>
+        <m:oMath>
+          <m:sSub>
+            <m:sSubPr>
+              <m:ctrlPr>
+                <w:rPr>
+                  <w:rFonts w:ascii="Cambria Math" w:hAnsi="Cambria Math" w:cs="B Yekan"/>
+                  <w:i/>
+                  <w:lang w:bidi="fa-IR"/>
+                </w:rPr>
+              </m:ctrlPr>
+            </m:sSubPr>
+            <m:e>
+              <m:r>
+                <w:rPr>
+                  <w:rFonts w:ascii="Cambria Math" w:hAnsi="Cambria Math" w:cs="B Yekan"/>
+                  <w:lang w:bidi="fa-IR"/>
+                </w:rPr>
+                <m:t>C</m:t>
+              </m:r>
+            </m:e>
+            <m:sub>
+              <m:r>
+                <w:rPr>
+                  <w:rFonts w:ascii="Cambria Math" w:hAnsi="Cambria Math" w:cs="B Yekan"/>
+                  <w:lang w:bidi="fa-IR"/>
+                </w:rPr>
+                <m:t>1</m:t>
+              </m:r>
+            </m:sub>
+          </m:sSub>
+          <m:r>
+            <w:rPr>
+              <w:rFonts w:ascii="Cambria Math" w:hAnsi="Cambria Math" w:cs="B Yekan"/>
+              <w:lang w:bidi="fa-IR"/>
+            </w:rPr>
+            <m:t>=</m:t>
+          </m:r>
+          <m:sSub>
+            <m:sSubPr>
+              <m:ctrlPr>
+                <w:rPr>
+                  <w:rFonts w:ascii="Cambria Math" w:hAnsi="Cambria Math" w:cs="B Yekan"/>
+                  <w:i/>
+                  <w:lang w:bidi="fa-IR"/>
+                </w:rPr>
+              </m:ctrlPr>
+            </m:sSubPr>
+            <m:e>
+              <m:r>
+                <w:rPr>
+                  <w:rFonts w:ascii="Cambria Math" w:hAnsi="Cambria Math" w:cs="B Yekan"/>
+                  <w:lang w:bidi="fa-IR"/>
+                </w:rPr>
+                <m:t>G</m:t>
+              </m:r>
+            </m:e>
+            <m:sub>
+              <m:r>
+                <w:rPr>
+                  <w:rFonts w:ascii="Cambria Math" w:hAnsi="Cambria Math" w:cs="B Yekan"/>
+                  <w:lang w:bidi="fa-IR"/>
+                </w:rPr>
+                <m:t>0</m:t>
+              </m:r>
+            </m:sub>
+          </m:sSub>
+          <m:r>
+            <w:rPr>
+              <w:rFonts w:ascii="Cambria Math" w:hAnsi="Cambria Math" w:cs="B Yekan"/>
+              <w:lang w:bidi="fa-IR"/>
+            </w:rPr>
+            <m:t>+</m:t>
+          </m:r>
+          <m:sSub>
+            <m:sSubPr>
+              <m:ctrlPr>
+                <w:rPr>
+                  <w:rFonts w:ascii="Cambria Math" w:hAnsi="Cambria Math" w:cs="B Yekan"/>
+                  <w:i/>
+                  <w:lang w:bidi="fa-IR"/>
+                </w:rPr>
+              </m:ctrlPr>
+            </m:sSubPr>
+            <m:e>
+              <m:r>
+                <w:rPr>
+                  <w:rFonts w:ascii="Cambria Math" w:hAnsi="Cambria Math" w:cs="B Yekan"/>
+                  <w:lang w:bidi="fa-IR"/>
+                </w:rPr>
+                <m:t>P</m:t>
+              </m:r>
+            </m:e>
+            <m:sub>
+              <m:r>
+                <w:rPr>
+                  <w:rFonts w:ascii="Cambria Math" w:hAnsi="Cambria Math" w:cs="B Yekan"/>
+                  <w:lang w:bidi="fa-IR"/>
+                </w:rPr>
+                <m:t>0</m:t>
+              </m:r>
+            </m:sub>
+          </m:sSub>
+          <m:sSub>
+            <m:sSubPr>
+              <m:ctrlPr>
+                <w:rPr>
+                  <w:rFonts w:ascii="Cambria Math" w:hAnsi="Cambria Math" w:cs="B Yekan"/>
+                  <w:i/>
+                  <w:lang w:bidi="fa-IR"/>
+                </w:rPr>
+              </m:ctrlPr>
+            </m:sSubPr>
+            <m:e>
+              <m:r>
+                <w:rPr>
+                  <w:rFonts w:ascii="Cambria Math" w:hAnsi="Cambria Math" w:cs="B Yekan"/>
+                  <w:lang w:bidi="fa-IR"/>
+                </w:rPr>
+                <m:t>C</m:t>
+              </m:r>
+            </m:e>
+            <m:sub>
+              <m:r>
+                <w:rPr>
+                  <w:rFonts w:ascii="Cambria Math" w:hAnsi="Cambria Math" w:cs="B Yekan"/>
+                  <w:lang w:bidi="fa-IR"/>
+                </w:rPr>
+                <m:t>0</m:t>
+              </m:r>
+            </m:sub>
+          </m:sSub>
+        </m:oMath>
+      </m:oMathPara>
+    </w:p>
+    <w:p>
+      <w:pPr>
+        <w:bidi/>
+        <w:jc w:val="right"/>
+        <w:rPr>
+          <w:rFonts w:eastAsiaTheme="minorEastAsia" w:cs="B Yekan"/>
+          <w:rtl/>
+          <w:lang w:bidi="fa-IR"/>
+        </w:rPr>
+      </w:pPr>
+      <m:oMathPara>
+        <m:oMathParaPr>
+          <m:jc m:val="left"/>
+        </m:oMathParaPr>
+        <m:oMath>
+          <m:sSub>
+            <m:sSubPr>
+              <m:ctrlPr>
+                <w:rPr>
+                  <w:rFonts w:ascii="Cambria Math" w:hAnsi="Cambria Math" w:cs="B Yekan"/>
+                  <w:i/>
+                  <w:lang w:bidi="fa-IR"/>
+                </w:rPr>
+              </m:ctrlPr>
+            </m:sSubPr>
+            <m:e>
+              <m:r>
+                <w:rPr>
+                  <w:rFonts w:ascii="Cambria Math" w:hAnsi="Cambria Math" w:cs="B Yekan"/>
+                  <w:lang w:bidi="fa-IR"/>
+                </w:rPr>
+                <m:t>C</m:t>
+              </m:r>
+            </m:e>
+            <m:sub>
+              <m:r>
+                <w:rPr>
+                  <w:rFonts w:ascii="Cambria Math" w:hAnsi="Cambria Math" w:cs="B Yekan"/>
+                  <w:lang w:bidi="fa-IR"/>
+                </w:rPr>
+                <m:t>2</m:t>
+              </m:r>
+            </m:sub>
+          </m:sSub>
+          <m:r>
+            <w:rPr>
+              <w:rFonts w:ascii="Cambria Math" w:hAnsi="Cambria Math" w:cs="B Yekan"/>
+              <w:lang w:bidi="fa-IR"/>
+            </w:rPr>
+            <m:t>=</m:t>
+          </m:r>
+          <m:sSub>
+            <m:sSubPr>
+              <m:ctrlPr>
+                <w:rPr>
+                  <w:rFonts w:ascii="Cambria Math" w:hAnsi="Cambria Math" w:cs="B Yekan"/>
+                  <w:i/>
+                  <w:lang w:bidi="fa-IR"/>
+                </w:rPr>
+              </m:ctrlPr>
+            </m:sSubPr>
+            <m:e>
+              <m:r>
+                <w:rPr>
+                  <w:rFonts w:ascii="Cambria Math" w:hAnsi="Cambria Math" w:cs="B Yekan"/>
+                  <w:lang w:bidi="fa-IR"/>
+                </w:rPr>
+                <m:t>G</m:t>
+              </m:r>
+            </m:e>
+            <m:sub>
+              <m:r>
+                <w:rPr>
+                  <w:rFonts w:ascii="Cambria Math" w:hAnsi="Cambria Math" w:cs="B Yekan"/>
+                  <w:lang w:bidi="fa-IR"/>
+                </w:rPr>
+                <m:t>1</m:t>
+              </m:r>
+            </m:sub>
+          </m:sSub>
+          <m:r>
+            <w:rPr>
+              <w:rFonts w:ascii="Cambria Math" w:hAnsi="Cambria Math" w:cs="B Yekan"/>
+              <w:lang w:bidi="fa-IR"/>
+            </w:rPr>
+            <m:t>+</m:t>
+          </m:r>
+          <m:sSub>
+            <m:sSubPr>
+              <m:ctrlPr>
+                <w:rPr>
+                  <w:rFonts w:ascii="Cambria Math" w:hAnsi="Cambria Math" w:cs="B Yekan"/>
+                  <w:i/>
+                  <w:lang w:bidi="fa-IR"/>
+                </w:rPr>
+              </m:ctrlPr>
+            </m:sSubPr>
+            <m:e>
+              <m:r>
+                <w:rPr>
+                  <w:rFonts w:ascii="Cambria Math" w:hAnsi="Cambria Math" w:cs="B Yekan"/>
+                  <w:lang w:bidi="fa-IR"/>
+                </w:rPr>
+                <m:t>P</m:t>
+              </m:r>
+            </m:e>
+            <m:sub>
+              <m:r>
+                <w:rPr>
+                  <w:rFonts w:ascii="Cambria Math" w:hAnsi="Cambria Math" w:cs="B Yekan"/>
+                  <w:lang w:bidi="fa-IR"/>
+                </w:rPr>
+                <m:t>1</m:t>
+              </m:r>
+            </m:sub>
+          </m:sSub>
+          <m:sSub>
+            <m:sSubPr>
+              <m:ctrlPr>
+                <w:rPr>
+                  <w:rFonts w:ascii="Cambria Math" w:hAnsi="Cambria Math" w:cs="B Yekan"/>
+                  <w:i/>
+                  <w:lang w:bidi="fa-IR"/>
+                </w:rPr>
+              </m:ctrlPr>
+            </m:sSubPr>
+            <m:e>
+              <m:r>
+                <w:rPr>
+                  <w:rFonts w:ascii="Cambria Math" w:hAnsi="Cambria Math" w:cs="B Yekan"/>
+                  <w:lang w:bidi="fa-IR"/>
+                </w:rPr>
+                <m:t>G</m:t>
+              </m:r>
+            </m:e>
+            <m:sub>
+              <m:r>
+                <w:rPr>
+                  <w:rFonts w:ascii="Cambria Math" w:hAnsi="Cambria Math" w:cs="B Yekan"/>
+                  <w:lang w:bidi="fa-IR"/>
+                </w:rPr>
+                <m:t>0</m:t>
+              </m:r>
+            </m:sub>
+          </m:sSub>
+          <m:r>
+            <w:rPr>
+              <w:rFonts w:ascii="Cambria Math" w:hAnsi="Cambria Math" w:cs="B Yekan"/>
+              <w:lang w:bidi="fa-IR"/>
+            </w:rPr>
+            <m:t>+</m:t>
+          </m:r>
+          <m:sSub>
+            <m:sSubPr>
+              <m:ctrlPr>
+                <w:rPr>
+                  <w:rFonts w:ascii="Cambria Math" w:hAnsi="Cambria Math" w:cs="B Yekan"/>
+                  <w:i/>
+                  <w:lang w:bidi="fa-IR"/>
+                </w:rPr>
+              </m:ctrlPr>
+            </m:sSubPr>
+            <m:e>
+              <m:r>
+                <w:rPr>
+                  <w:rFonts w:ascii="Cambria Math" w:hAnsi="Cambria Math" w:cs="B Yekan"/>
+                  <w:lang w:bidi="fa-IR"/>
+                </w:rPr>
+                <m:t>P</m:t>
+              </m:r>
+            </m:e>
+            <m:sub>
+              <m:r>
+                <w:rPr>
+                  <w:rFonts w:ascii="Cambria Math" w:hAnsi="Cambria Math" w:cs="B Yekan"/>
+                  <w:lang w:bidi="fa-IR"/>
+                </w:rPr>
+                <m:t>1</m:t>
+              </m:r>
+            </m:sub>
+          </m:sSub>
+          <m:sSub>
+            <m:sSubPr>
+              <m:ctrlPr>
+                <w:rPr>
+                  <w:rFonts w:ascii="Cambria Math" w:hAnsi="Cambria Math" w:cs="B Yekan"/>
+                  <w:i/>
+                  <w:lang w:bidi="fa-IR"/>
+                </w:rPr>
+              </m:ctrlPr>
+            </m:sSubPr>
+            <m:e>
+              <m:r>
+                <w:rPr>
+                  <w:rFonts w:ascii="Cambria Math" w:hAnsi="Cambria Math" w:cs="B Yekan"/>
+                  <w:lang w:bidi="fa-IR"/>
+                </w:rPr>
+                <m:t>P</m:t>
+              </m:r>
+            </m:e>
+            <m:sub>
+              <m:r>
+                <w:rPr>
+                  <w:rFonts w:ascii="Cambria Math" w:hAnsi="Cambria Math" w:cs="B Yekan"/>
+                  <w:lang w:bidi="fa-IR"/>
+                </w:rPr>
+                <m:t>0</m:t>
+              </m:r>
+            </m:sub>
+          </m:sSub>
+          <m:sSub>
+            <m:sSubPr>
+              <m:ctrlPr>
+                <w:rPr>
+                  <w:rFonts w:ascii="Cambria Math" w:hAnsi="Cambria Math" w:cs="B Yekan"/>
+                  <w:i/>
+                  <w:lang w:bidi="fa-IR"/>
+                </w:rPr>
+              </m:ctrlPr>
+            </m:sSubPr>
+            <m:e>
+              <m:r>
+                <w:rPr>
+                  <w:rFonts w:ascii="Cambria Math" w:hAnsi="Cambria Math" w:cs="B Yekan"/>
+                  <w:lang w:bidi="fa-IR"/>
+                </w:rPr>
+                <m:t>C</m:t>
+              </m:r>
+            </m:e>
+            <m:sub>
+              <m:r>
+                <w:rPr>
+                  <w:rFonts w:ascii="Cambria Math" w:hAnsi="Cambria Math" w:cs="B Yekan"/>
+                  <w:lang w:bidi="fa-IR"/>
+                </w:rPr>
+                <m:t>0</m:t>
+              </m:r>
+            </m:sub>
+          </m:sSub>
+        </m:oMath>
+      </m:oMathPara>
+    </w:p>
+    <w:p>
+      <w:pPr>
+        <w:bidi/>
+        <w:jc w:val="right"/>
+        <w:rPr>
+          <w:rFonts w:eastAsiaTheme="minorEastAsia" w:cs="B Yekan"/>
+          <w:rtl/>
+          <w:lang w:bidi="fa-IR"/>
+        </w:rPr>
+      </w:pPr>
+      <m:oMathPara>
+        <m:oMathParaPr>
+          <m:jc m:val="left"/>
+        </m:oMathParaPr>
+        <m:oMath>
+          <m:sSub>
+            <m:sSubPr>
+              <m:ctrlPr>
+                <w:rPr>
+                  <w:rFonts w:ascii="Cambria Math" w:hAnsi="Cambria Math" w:cs="B Yekan"/>
+                  <w:i/>
+                  <w:lang w:bidi="fa-IR"/>
+                </w:rPr>
+              </m:ctrlPr>
+            </m:sSubPr>
+            <m:e>
+              <m:r>
+                <w:rPr>
+                  <w:rFonts w:ascii="Cambria Math" w:hAnsi="Cambria Math" w:cs="B Yekan"/>
+                  <w:lang w:bidi="fa-IR"/>
+                </w:rPr>
+                <m:t>C</m:t>
+              </m:r>
+            </m:e>
+            <m:sub>
+              <m:r>
+                <w:rPr>
+                  <w:rFonts w:ascii="Cambria Math" w:hAnsi="Cambria Math" w:cs="B Yekan"/>
+                  <w:lang w:bidi="fa-IR"/>
+                </w:rPr>
+                <m:t>3</m:t>
+              </m:r>
+            </m:sub>
+          </m:sSub>
+          <m:r>
+            <w:rPr>
+              <w:rFonts w:ascii="Cambria Math" w:hAnsi="Cambria Math" w:cs="B Yekan"/>
+              <w:lang w:bidi="fa-IR"/>
+            </w:rPr>
+            <m:t>=</m:t>
+          </m:r>
+          <m:sSub>
+            <m:sSubPr>
+              <m:ctrlPr>
+                <w:rPr>
+                  <w:rFonts w:ascii="Cambria Math" w:hAnsi="Cambria Math" w:cs="B Yekan"/>
+                  <w:i/>
+                  <w:lang w:bidi="fa-IR"/>
+                </w:rPr>
+              </m:ctrlPr>
+            </m:sSubPr>
+            <m:e>
+              <m:r>
+                <w:rPr>
+                  <w:rFonts w:ascii="Cambria Math" w:hAnsi="Cambria Math" w:cs="B Yekan"/>
+                  <w:lang w:bidi="fa-IR"/>
+                </w:rPr>
+                <m:t>G</m:t>
+              </m:r>
+            </m:e>
+            <m:sub>
+              <m:r>
+                <w:rPr>
+                  <w:rFonts w:ascii="Cambria Math" w:hAnsi="Cambria Math" w:cs="B Yekan"/>
+                  <w:lang w:bidi="fa-IR"/>
+                </w:rPr>
+                <m:t>2</m:t>
+              </m:r>
+            </m:sub>
+          </m:sSub>
+          <m:r>
+            <w:rPr>
+              <w:rFonts w:ascii="Cambria Math" w:hAnsi="Cambria Math" w:cs="B Yekan"/>
+              <w:lang w:bidi="fa-IR"/>
+            </w:rPr>
+            <m:t>+</m:t>
+          </m:r>
+          <m:sSub>
+            <m:sSubPr>
+              <m:ctrlPr>
+                <w:rPr>
+                  <w:rFonts w:ascii="Cambria Math" w:hAnsi="Cambria Math" w:cs="B Yekan"/>
+                  <w:i/>
+                  <w:lang w:bidi="fa-IR"/>
+                </w:rPr>
+              </m:ctrlPr>
+            </m:sSubPr>
+            <m:e>
+              <m:r>
+                <w:rPr>
+                  <w:rFonts w:ascii="Cambria Math" w:hAnsi="Cambria Math" w:cs="B Yekan"/>
+                  <w:lang w:bidi="fa-IR"/>
+                </w:rPr>
+                <m:t>P</m:t>
+              </m:r>
+            </m:e>
+            <m:sub>
+              <m:r>
+                <w:rPr>
+                  <w:rFonts w:ascii="Cambria Math" w:hAnsi="Cambria Math" w:cs="B Yekan"/>
+                  <w:lang w:bidi="fa-IR"/>
+                </w:rPr>
+                <m:t>2</m:t>
+              </m:r>
+            </m:sub>
+          </m:sSub>
+          <m:sSub>
+            <m:sSubPr>
+              <m:ctrlPr>
+                <w:rPr>
+                  <w:rFonts w:ascii="Cambria Math" w:hAnsi="Cambria Math" w:cs="B Yekan"/>
+                  <w:i/>
+                  <w:lang w:bidi="fa-IR"/>
+                </w:rPr>
+              </m:ctrlPr>
+            </m:sSubPr>
+            <m:e>
+              <m:r>
+                <w:rPr>
+                  <w:rFonts w:ascii="Cambria Math" w:hAnsi="Cambria Math" w:cs="B Yekan"/>
+                  <w:lang w:bidi="fa-IR"/>
+                </w:rPr>
+                <m:t>G</m:t>
+              </m:r>
+            </m:e>
+            <m:sub>
+              <m:r>
+                <w:rPr>
+                  <w:rFonts w:ascii="Cambria Math" w:hAnsi="Cambria Math" w:cs="B Yekan"/>
+                  <w:lang w:bidi="fa-IR"/>
+                </w:rPr>
+                <m:t>1</m:t>
+              </m:r>
+            </m:sub>
+          </m:sSub>
+          <m:r>
+            <w:rPr>
+              <w:rFonts w:ascii="Cambria Math" w:hAnsi="Cambria Math" w:cs="B Yekan"/>
+              <w:lang w:bidi="fa-IR"/>
+            </w:rPr>
+            <m:t>+</m:t>
+          </m:r>
+          <m:sSub>
+            <m:sSubPr>
+              <m:ctrlPr>
+                <w:rPr>
+                  <w:rFonts w:ascii="Cambria Math" w:hAnsi="Cambria Math" w:cs="B Yekan"/>
+                  <w:i/>
+                  <w:lang w:bidi="fa-IR"/>
+                </w:rPr>
+              </m:ctrlPr>
+            </m:sSubPr>
+            <m:e>
+              <m:r>
+                <w:rPr>
+                  <w:rFonts w:ascii="Cambria Math" w:hAnsi="Cambria Math" w:cs="B Yekan"/>
+                  <w:lang w:bidi="fa-IR"/>
+                </w:rPr>
+                <m:t>P</m:t>
+              </m:r>
+            </m:e>
+            <m:sub>
+              <m:r>
+                <w:rPr>
+                  <w:rFonts w:ascii="Cambria Math" w:hAnsi="Cambria Math" w:cs="B Yekan"/>
+                  <w:lang w:bidi="fa-IR"/>
+                </w:rPr>
+                <m:t>2</m:t>
+              </m:r>
+            </m:sub>
+          </m:sSub>
+          <m:sSub>
+            <m:sSubPr>
+              <m:ctrlPr>
+                <w:rPr>
+                  <w:rFonts w:ascii="Cambria Math" w:hAnsi="Cambria Math" w:cs="B Yekan"/>
+                  <w:i/>
+                  <w:lang w:bidi="fa-IR"/>
+                </w:rPr>
+              </m:ctrlPr>
+            </m:sSubPr>
+            <m:e>
+              <m:r>
+                <w:rPr>
+                  <w:rFonts w:ascii="Cambria Math" w:hAnsi="Cambria Math" w:cs="B Yekan"/>
+                  <w:lang w:bidi="fa-IR"/>
+                </w:rPr>
+                <m:t>P</m:t>
+              </m:r>
+            </m:e>
+            <m:sub>
+              <m:r>
+                <w:rPr>
+                  <w:rFonts w:ascii="Cambria Math" w:hAnsi="Cambria Math" w:cs="B Yekan"/>
+                  <w:lang w:bidi="fa-IR"/>
+                </w:rPr>
+                <m:t>1</m:t>
+              </m:r>
+            </m:sub>
+          </m:sSub>
+          <m:sSub>
+            <m:sSubPr>
+              <m:ctrlPr>
+                <w:rPr>
+                  <w:rFonts w:ascii="Cambria Math" w:hAnsi="Cambria Math" w:cs="B Yekan"/>
+                  <w:i/>
+                  <w:lang w:bidi="fa-IR"/>
+                </w:rPr>
+              </m:ctrlPr>
+            </m:sSubPr>
+            <m:e>
+              <m:r>
+                <w:rPr>
+                  <w:rFonts w:ascii="Cambria Math" w:hAnsi="Cambria Math" w:cs="B Yekan"/>
+                  <w:lang w:bidi="fa-IR"/>
+                </w:rPr>
+                <m:t>G</m:t>
+              </m:r>
+            </m:e>
+            <m:sub>
+              <m:r>
+                <w:rPr>
+                  <w:rFonts w:ascii="Cambria Math" w:hAnsi="Cambria Math" w:cs="B Yekan"/>
+                  <w:lang w:bidi="fa-IR"/>
+                </w:rPr>
+                <m:t>0</m:t>
+              </m:r>
+            </m:sub>
+          </m:sSub>
+          <m:r>
+            <w:rPr>
+              <w:rFonts w:ascii="Cambria Math" w:hAnsi="Cambria Math" w:cs="B Yekan"/>
+              <w:lang w:bidi="fa-IR"/>
+            </w:rPr>
+            <m:t>+</m:t>
+          </m:r>
+          <m:sSub>
+            <m:sSubPr>
+              <m:ctrlPr>
+                <w:rPr>
+                  <w:rFonts w:ascii="Cambria Math" w:hAnsi="Cambria Math" w:cs="B Yekan"/>
+                  <w:i/>
+                  <w:lang w:bidi="fa-IR"/>
+                </w:rPr>
+              </m:ctrlPr>
+            </m:sSubPr>
+            <m:e>
+              <m:r>
+                <w:rPr>
+                  <w:rFonts w:ascii="Cambria Math" w:hAnsi="Cambria Math" w:cs="B Yekan"/>
+                  <w:lang w:bidi="fa-IR"/>
+                </w:rPr>
+                <m:t>P</m:t>
+              </m:r>
+            </m:e>
+            <m:sub>
+              <m:r>
+                <w:rPr>
+                  <w:rFonts w:ascii="Cambria Math" w:hAnsi="Cambria Math" w:cs="B Yekan"/>
+                  <w:lang w:bidi="fa-IR"/>
+                </w:rPr>
+                <m:t>2</m:t>
+              </m:r>
+            </m:sub>
+          </m:sSub>
+          <m:sSub>
+            <m:sSubPr>
+              <m:ctrlPr>
+                <w:rPr>
+                  <w:rFonts w:ascii="Cambria Math" w:hAnsi="Cambria Math" w:cs="B Yekan"/>
+                  <w:i/>
+                  <w:lang w:bidi="fa-IR"/>
+                </w:rPr>
+              </m:ctrlPr>
+            </m:sSubPr>
+            <m:e>
+              <m:r>
+                <w:rPr>
+                  <w:rFonts w:ascii="Cambria Math" w:hAnsi="Cambria Math" w:cs="B Yekan"/>
+                  <w:lang w:bidi="fa-IR"/>
+                </w:rPr>
+                <m:t>P</m:t>
+              </m:r>
+            </m:e>
+            <m:sub>
+              <m:r>
+                <w:rPr>
+                  <w:rFonts w:ascii="Cambria Math" w:hAnsi="Cambria Math" w:cs="B Yekan"/>
+                  <w:lang w:bidi="fa-IR"/>
+                </w:rPr>
+                <m:t>1</m:t>
+              </m:r>
+            </m:sub>
+          </m:sSub>
+          <m:sSub>
+            <m:sSubPr>
+              <m:ctrlPr>
+                <w:rPr>
+                  <w:rFonts w:ascii="Cambria Math" w:hAnsi="Cambria Math" w:cs="B Yekan"/>
+                  <w:i/>
+                  <w:lang w:bidi="fa-IR"/>
+                </w:rPr>
+              </m:ctrlPr>
+            </m:sSubPr>
+            <m:e>
+              <m:r>
+                <w:rPr>
+                  <w:rFonts w:ascii="Cambria Math" w:hAnsi="Cambria Math" w:cs="B Yekan"/>
+                  <w:lang w:bidi="fa-IR"/>
+                </w:rPr>
+                <m:t>P</m:t>
+              </m:r>
+            </m:e>
+            <m:sub>
+              <m:r>
+                <w:rPr>
+                  <w:rFonts w:ascii="Cambria Math" w:hAnsi="Cambria Math" w:cs="B Yekan"/>
+                  <w:lang w:bidi="fa-IR"/>
+                </w:rPr>
+                <m:t>0</m:t>
+              </m:r>
+            </m:sub>
+          </m:sSub>
+          <m:sSub>
+            <m:sSubPr>
+              <m:ctrlPr>
+                <w:rPr>
+                  <w:rFonts w:ascii="Cambria Math" w:hAnsi="Cambria Math" w:cs="B Yekan"/>
+                  <w:i/>
+                  <w:lang w:bidi="fa-IR"/>
+                </w:rPr>
+              </m:ctrlPr>
+            </m:sSubPr>
+            <m:e>
+              <m:r>
+                <w:rPr>
+                  <w:rFonts w:ascii="Cambria Math" w:hAnsi="Cambria Math" w:cs="B Yekan"/>
+                  <w:lang w:bidi="fa-IR"/>
+                </w:rPr>
+                <m:t>C</m:t>
+              </m:r>
+            </m:e>
+            <m:sub>
+              <m:r>
+                <w:rPr>
+                  <w:rFonts w:ascii="Cambria Math" w:hAnsi="Cambria Math" w:cs="B Yekan"/>
+                  <w:lang w:bidi="fa-IR"/>
+                </w:rPr>
+                <m:t>0</m:t>
+              </m:r>
+            </m:sub>
+          </m:sSub>
+        </m:oMath>
+      </m:oMathPara>
+    </w:p>
+    <w:p>
+      <w:pPr>
+        <w:bidi/>
+        <w:jc w:val="right"/>
+        <w:rPr>
+          <w:rFonts w:eastAsiaTheme="minorEastAsia" w:cs="B Yekan"/>
+          <w:rtl/>
+          <w:lang w:bidi="fa-IR"/>
+        </w:rPr>
+      </w:pPr>
+      <m:oMathPara>
+        <m:oMathParaPr>
+          <m:jc m:val="left"/>
+        </m:oMathParaPr>
+        <m:oMath>
+          <m:sSub>
+            <m:sSubPr>
+              <m:ctrlPr>
+                <w:rPr>
+                  <w:rFonts w:ascii="Cambria Math" w:hAnsi="Cambria Math" w:cs="B Yekan"/>
+                  <w:i/>
+                  <w:lang w:bidi="fa-IR"/>
+                </w:rPr>
+              </m:ctrlPr>
+            </m:sSubPr>
+            <m:e>
+              <m:r>
+                <w:rPr>
+                  <w:rFonts w:ascii="Cambria Math" w:hAnsi="Cambria Math" w:cs="B Yekan"/>
+                  <w:lang w:bidi="fa-IR"/>
+                </w:rPr>
+                <m:t>C</m:t>
+              </m:r>
+            </m:e>
+            <m:sub>
+              <m:r>
+                <w:rPr>
+                  <w:rFonts w:ascii="Cambria Math" w:hAnsi="Cambria Math" w:cs="B Yekan"/>
+                  <w:lang w:bidi="fa-IR"/>
+                </w:rPr>
+                <m:t>4</m:t>
+              </m:r>
+            </m:sub>
+          </m:sSub>
+          <m:r>
+            <w:rPr>
+              <w:rFonts w:ascii="Cambria Math" w:hAnsi="Cambria Math" w:cs="B Yekan"/>
+              <w:lang w:bidi="fa-IR"/>
+            </w:rPr>
+            <m:t>=</m:t>
+          </m:r>
+          <m:sSub>
+            <m:sSubPr>
+              <m:ctrlPr>
+                <w:rPr>
+                  <w:rFonts w:ascii="Cambria Math" w:hAnsi="Cambria Math" w:cs="B Yekan"/>
+                  <w:i/>
+                  <w:lang w:bidi="fa-IR"/>
+                </w:rPr>
+              </m:ctrlPr>
+            </m:sSubPr>
+            <m:e>
+              <m:r>
+                <w:rPr>
+                  <w:rFonts w:ascii="Cambria Math" w:hAnsi="Cambria Math" w:cs="B Yekan"/>
+                  <w:lang w:bidi="fa-IR"/>
+                </w:rPr>
+                <m:t>G</m:t>
+              </m:r>
+            </m:e>
+            <m:sub>
+              <m:r>
+                <w:rPr>
+                  <w:rFonts w:ascii="Cambria Math" w:hAnsi="Cambria Math" w:cs="B Yekan"/>
+                  <w:lang w:bidi="fa-IR"/>
+                </w:rPr>
+                <m:t>3</m:t>
+              </m:r>
+            </m:sub>
+          </m:sSub>
+          <m:r>
+            <w:rPr>
+              <w:rFonts w:ascii="Cambria Math" w:hAnsi="Cambria Math" w:cs="B Yekan"/>
+              <w:lang w:bidi="fa-IR"/>
+            </w:rPr>
+            <m:t>+</m:t>
+          </m:r>
+          <m:sSub>
+            <m:sSubPr>
+              <m:ctrlPr>
+                <w:rPr>
+                  <w:rFonts w:ascii="Cambria Math" w:hAnsi="Cambria Math" w:cs="B Yekan"/>
+                  <w:i/>
+                  <w:lang w:bidi="fa-IR"/>
+                </w:rPr>
+              </m:ctrlPr>
+            </m:sSubPr>
+            <m:e>
+              <m:r>
+                <w:rPr>
+                  <w:rFonts w:ascii="Cambria Math" w:hAnsi="Cambria Math" w:cs="B Yekan"/>
+                  <w:lang w:bidi="fa-IR"/>
+                </w:rPr>
+                <m:t>P</m:t>
+              </m:r>
+            </m:e>
+            <m:sub>
+              <m:r>
+                <w:rPr>
+                  <w:rFonts w:ascii="Cambria Math" w:hAnsi="Cambria Math" w:cs="B Yekan"/>
+                  <w:lang w:bidi="fa-IR"/>
+                </w:rPr>
+                <m:t>3</m:t>
+              </m:r>
+            </m:sub>
+          </m:sSub>
+          <m:sSub>
+            <m:sSubPr>
+              <m:ctrlPr>
+                <w:rPr>
+                  <w:rFonts w:ascii="Cambria Math" w:hAnsi="Cambria Math" w:cs="B Yekan"/>
+                  <w:i/>
+                  <w:lang w:bidi="fa-IR"/>
+                </w:rPr>
+              </m:ctrlPr>
+            </m:sSubPr>
+            <m:e>
+              <m:r>
+                <w:rPr>
+                  <w:rFonts w:ascii="Cambria Math" w:hAnsi="Cambria Math" w:cs="B Yekan"/>
+                  <w:lang w:bidi="fa-IR"/>
+                </w:rPr>
+                <m:t>G</m:t>
+              </m:r>
+            </m:e>
+            <m:sub>
+              <m:r>
+                <w:rPr>
+                  <w:rFonts w:ascii="Cambria Math" w:hAnsi="Cambria Math" w:cs="B Yekan"/>
+                  <w:lang w:bidi="fa-IR"/>
+                </w:rPr>
+                <m:t>2</m:t>
+              </m:r>
+            </m:sub>
+          </m:sSub>
+          <m:r>
+            <w:rPr>
+              <w:rFonts w:ascii="Cambria Math" w:hAnsi="Cambria Math" w:cs="B Yekan"/>
+              <w:lang w:bidi="fa-IR"/>
+            </w:rPr>
+            <m:t>+</m:t>
+          </m:r>
+          <m:sSub>
+            <m:sSubPr>
+              <m:ctrlPr>
+                <w:rPr>
+                  <w:rFonts w:ascii="Cambria Math" w:hAnsi="Cambria Math" w:cs="B Yekan"/>
+                  <w:i/>
+                  <w:lang w:bidi="fa-IR"/>
+                </w:rPr>
+              </m:ctrlPr>
+            </m:sSubPr>
+            <m:e>
+              <m:r>
+                <w:rPr>
+                  <w:rFonts w:ascii="Cambria Math" w:hAnsi="Cambria Math" w:cs="B Yekan"/>
+                  <w:lang w:bidi="fa-IR"/>
+                </w:rPr>
+                <m:t>P</m:t>
+              </m:r>
+            </m:e>
+            <m:sub>
+              <m:r>
+                <w:rPr>
+                  <w:rFonts w:ascii="Cambria Math" w:hAnsi="Cambria Math" w:cs="B Yekan"/>
+                  <w:lang w:bidi="fa-IR"/>
+                </w:rPr>
+                <m:t>3</m:t>
+              </m:r>
+            </m:sub>
+          </m:sSub>
+          <m:sSub>
+            <m:sSubPr>
+              <m:ctrlPr>
+                <w:rPr>
+                  <w:rFonts w:ascii="Cambria Math" w:hAnsi="Cambria Math" w:cs="B Yekan"/>
+                  <w:i/>
+                  <w:lang w:bidi="fa-IR"/>
+                </w:rPr>
+              </m:ctrlPr>
+            </m:sSubPr>
+            <m:e>
+              <m:r>
+                <w:rPr>
+                  <w:rFonts w:ascii="Cambria Math" w:hAnsi="Cambria Math" w:cs="B Yekan"/>
+                  <w:lang w:bidi="fa-IR"/>
+                </w:rPr>
+                <m:t>P</m:t>
+              </m:r>
+            </m:e>
+            <m:sub>
+              <m:r>
+                <w:rPr>
+                  <w:rFonts w:ascii="Cambria Math" w:hAnsi="Cambria Math" w:cs="B Yekan"/>
+                  <w:lang w:bidi="fa-IR"/>
+                </w:rPr>
+                <m:t>2</m:t>
+              </m:r>
+            </m:sub>
+          </m:sSub>
+          <m:sSub>
+            <m:sSubPr>
+              <m:ctrlPr>
+                <w:rPr>
+                  <w:rFonts w:ascii="Cambria Math" w:hAnsi="Cambria Math" w:cs="B Yekan"/>
+                  <w:i/>
+                  <w:lang w:bidi="fa-IR"/>
+                </w:rPr>
+              </m:ctrlPr>
+            </m:sSubPr>
+            <m:e>
+              <m:r>
+                <w:rPr>
+                  <w:rFonts w:ascii="Cambria Math" w:hAnsi="Cambria Math" w:cs="B Yekan"/>
+                  <w:lang w:bidi="fa-IR"/>
+                </w:rPr>
+                <m:t>G</m:t>
+              </m:r>
+            </m:e>
+            <m:sub>
+              <m:r>
+                <w:rPr>
+                  <w:rFonts w:ascii="Cambria Math" w:hAnsi="Cambria Math" w:cs="B Yekan"/>
+                  <w:lang w:bidi="fa-IR"/>
+                </w:rPr>
+                <m:t>1</m:t>
+              </m:r>
+            </m:sub>
+          </m:sSub>
+          <m:r>
+            <w:rPr>
+              <w:rFonts w:ascii="Cambria Math" w:hAnsi="Cambria Math" w:cs="B Yekan"/>
+              <w:lang w:bidi="fa-IR"/>
+            </w:rPr>
+            <m:t>+</m:t>
+          </m:r>
+          <m:sSub>
+            <m:sSubPr>
+              <m:ctrlPr>
+                <w:rPr>
+                  <w:rFonts w:ascii="Cambria Math" w:hAnsi="Cambria Math" w:cs="B Yekan"/>
+                  <w:i/>
+                  <w:lang w:bidi="fa-IR"/>
+                </w:rPr>
+              </m:ctrlPr>
+            </m:sSubPr>
+            <m:e>
+              <m:r>
+                <w:rPr>
+                  <w:rFonts w:ascii="Cambria Math" w:hAnsi="Cambria Math" w:cs="B Yekan"/>
+                  <w:lang w:bidi="fa-IR"/>
+                </w:rPr>
+                <m:t>P</m:t>
+              </m:r>
+            </m:e>
+            <m:sub>
+              <m:r>
+                <w:rPr>
+                  <w:rFonts w:ascii="Cambria Math" w:hAnsi="Cambria Math" w:cs="B Yekan"/>
+                  <w:lang w:bidi="fa-IR"/>
+                </w:rPr>
+                <m:t>3</m:t>
+              </m:r>
+            </m:sub>
+          </m:sSub>
+          <m:sSub>
+            <m:sSubPr>
+              <m:ctrlPr>
+                <w:rPr>
+                  <w:rFonts w:ascii="Cambria Math" w:hAnsi="Cambria Math" w:cs="B Yekan"/>
+                  <w:i/>
+                  <w:lang w:bidi="fa-IR"/>
+                </w:rPr>
+              </m:ctrlPr>
+            </m:sSubPr>
+            <m:e>
+              <m:r>
+                <w:rPr>
+                  <w:rFonts w:ascii="Cambria Math" w:hAnsi="Cambria Math" w:cs="B Yekan"/>
+                  <w:lang w:bidi="fa-IR"/>
+                </w:rPr>
+                <m:t>P</m:t>
+              </m:r>
+            </m:e>
+            <m:sub>
+              <m:r>
+                <w:rPr>
+                  <w:rFonts w:ascii="Cambria Math" w:hAnsi="Cambria Math" w:cs="B Yekan"/>
+                  <w:lang w:bidi="fa-IR"/>
+                </w:rPr>
+                <m:t>2</m:t>
+              </m:r>
+            </m:sub>
+          </m:sSub>
+          <m:sSub>
+            <m:sSubPr>
+              <m:ctrlPr>
+                <w:rPr>
+                  <w:rFonts w:ascii="Cambria Math" w:hAnsi="Cambria Math" w:cs="B Yekan"/>
+                  <w:i/>
+                  <w:lang w:bidi="fa-IR"/>
+                </w:rPr>
+              </m:ctrlPr>
+            </m:sSubPr>
+            <m:e>
+              <m:r>
+                <w:rPr>
+                  <w:rFonts w:ascii="Cambria Math" w:hAnsi="Cambria Math" w:cs="B Yekan"/>
+                  <w:lang w:bidi="fa-IR"/>
+                </w:rPr>
+                <m:t>P</m:t>
+              </m:r>
+            </m:e>
+            <m:sub>
+              <m:r>
+                <w:rPr>
+                  <w:rFonts w:ascii="Cambria Math" w:hAnsi="Cambria Math" w:cs="B Yekan"/>
+                  <w:lang w:bidi="fa-IR"/>
+                </w:rPr>
+                <m:t>1</m:t>
+              </m:r>
+            </m:sub>
+          </m:sSub>
+          <m:sSub>
+            <m:sSubPr>
+              <m:ctrlPr>
+                <w:rPr>
+                  <w:rFonts w:ascii="Cambria Math" w:hAnsi="Cambria Math" w:cs="B Yekan"/>
+                  <w:i/>
+                  <w:lang w:bidi="fa-IR"/>
+                </w:rPr>
+              </m:ctrlPr>
+            </m:sSubPr>
+            <m:e>
+              <m:r>
+                <w:rPr>
+                  <w:rFonts w:ascii="Cambria Math" w:hAnsi="Cambria Math" w:cs="B Yekan"/>
+                  <w:lang w:bidi="fa-IR"/>
+                </w:rPr>
+                <m:t>G</m:t>
+              </m:r>
+            </m:e>
+            <m:sub>
+              <m:r>
+                <w:rPr>
+                  <w:rFonts w:ascii="Cambria Math" w:hAnsi="Cambria Math" w:cs="B Yekan"/>
+                  <w:lang w:bidi="fa-IR"/>
+                </w:rPr>
+                <m:t>0</m:t>
+              </m:r>
+            </m:sub>
+          </m:sSub>
+          <m:r>
+            <w:rPr>
+              <w:rFonts w:ascii="Cambria Math" w:hAnsi="Cambria Math" w:cs="B Yekan"/>
+              <w:lang w:bidi="fa-IR"/>
+            </w:rPr>
+            <m:t>+</m:t>
+          </m:r>
+          <m:sSub>
+            <m:sSubPr>
+              <m:ctrlPr>
+                <w:rPr>
+                  <w:rFonts w:ascii="Cambria Math" w:hAnsi="Cambria Math" w:cs="B Yekan"/>
+                  <w:i/>
+                  <w:lang w:bidi="fa-IR"/>
+                </w:rPr>
+              </m:ctrlPr>
+            </m:sSubPr>
+            <m:e>
+              <m:r>
+                <w:rPr>
+                  <w:rFonts w:ascii="Cambria Math" w:hAnsi="Cambria Math" w:cs="B Yekan"/>
+                  <w:lang w:bidi="fa-IR"/>
+                </w:rPr>
+                <m:t>P</m:t>
+              </m:r>
+            </m:e>
+            <m:sub>
+              <m:r>
+                <w:rPr>
+                  <w:rFonts w:ascii="Cambria Math" w:hAnsi="Cambria Math" w:cs="B Yekan"/>
+                  <w:lang w:bidi="fa-IR"/>
+                </w:rPr>
+                <m:t>3</m:t>
+              </m:r>
+            </m:sub>
+          </m:sSub>
+          <m:r>
+            <w:rPr>
+              <w:rFonts w:ascii="Cambria Math" w:hAnsi="Cambria Math" w:cs="B Yekan"/>
+              <w:lang w:bidi="fa-IR"/>
+            </w:rPr>
+            <m:t xml:space="preserve"> </m:t>
+          </m:r>
+          <m:sSub>
+            <m:sSubPr>
+              <m:ctrlPr>
+                <w:rPr>
+                  <w:rFonts w:ascii="Cambria Math" w:hAnsi="Cambria Math" w:cs="B Yekan"/>
+                  <w:i/>
+                  <w:lang w:bidi="fa-IR"/>
+                </w:rPr>
+              </m:ctrlPr>
+            </m:sSubPr>
+            <m:e>
+              <m:r>
+                <w:rPr>
+                  <w:rFonts w:ascii="Cambria Math" w:hAnsi="Cambria Math" w:cs="B Yekan"/>
+                  <w:lang w:bidi="fa-IR"/>
+                </w:rPr>
+                <m:t>P</m:t>
+              </m:r>
+            </m:e>
+            <m:sub>
+              <m:r>
+                <w:rPr>
+                  <w:rFonts w:ascii="Cambria Math" w:hAnsi="Cambria Math" w:cs="B Yekan"/>
+                  <w:lang w:bidi="fa-IR"/>
+                </w:rPr>
+                <m:t>2</m:t>
+              </m:r>
+            </m:sub>
+          </m:sSub>
+          <m:sSub>
+            <m:sSubPr>
+              <m:ctrlPr>
+                <w:rPr>
+                  <w:rFonts w:ascii="Cambria Math" w:hAnsi="Cambria Math" w:cs="B Yekan"/>
+                  <w:i/>
+                  <w:lang w:bidi="fa-IR"/>
+                </w:rPr>
+              </m:ctrlPr>
+            </m:sSubPr>
+            <m:e>
+              <m:r>
+                <w:rPr>
+                  <w:rFonts w:ascii="Cambria Math" w:hAnsi="Cambria Math" w:cs="B Yekan"/>
+                  <w:lang w:bidi="fa-IR"/>
+                </w:rPr>
+                <m:t>P</m:t>
+              </m:r>
+            </m:e>
+            <m:sub>
+              <m:r>
+                <w:rPr>
+                  <w:rFonts w:ascii="Cambria Math" w:hAnsi="Cambria Math" w:cs="B Yekan"/>
+                  <w:lang w:bidi="fa-IR"/>
+                </w:rPr>
+                <m:t>1</m:t>
+              </m:r>
+            </m:sub>
+          </m:sSub>
+          <m:sSub>
+            <m:sSubPr>
+              <m:ctrlPr>
+                <w:rPr>
+                  <w:rFonts w:ascii="Cambria Math" w:hAnsi="Cambria Math" w:cs="B Yekan"/>
+                  <w:i/>
+                  <w:lang w:bidi="fa-IR"/>
+                </w:rPr>
+              </m:ctrlPr>
+            </m:sSubPr>
+            <m:e>
+              <m:r>
+                <w:rPr>
+                  <w:rFonts w:ascii="Cambria Math" w:hAnsi="Cambria Math" w:cs="B Yekan"/>
+                  <w:lang w:bidi="fa-IR"/>
+                </w:rPr>
+                <m:t>P</m:t>
+              </m:r>
+            </m:e>
+            <m:sub>
+              <m:r>
+                <w:rPr>
+                  <w:rFonts w:ascii="Cambria Math" w:hAnsi="Cambria Math" w:cs="B Yekan"/>
+                  <w:lang w:bidi="fa-IR"/>
+                </w:rPr>
+                <m:t>0</m:t>
+              </m:r>
+            </m:sub>
+          </m:sSub>
+          <m:sSub>
+            <m:sSubPr>
+              <m:ctrlPr>
+                <w:rPr>
+                  <w:rFonts w:ascii="Cambria Math" w:hAnsi="Cambria Math" w:cs="B Yekan"/>
+                  <w:i/>
+                  <w:lang w:bidi="fa-IR"/>
+                </w:rPr>
+              </m:ctrlPr>
+            </m:sSubPr>
+            <m:e>
+              <m:r>
+                <w:rPr>
+                  <w:rFonts w:ascii="Cambria Math" w:hAnsi="Cambria Math" w:cs="B Yekan"/>
+                  <w:lang w:bidi="fa-IR"/>
+                </w:rPr>
+                <m:t>C</m:t>
+              </m:r>
+            </m:e>
+            <m:sub>
+              <m:r>
+                <w:rPr>
+                  <w:rFonts w:ascii="Cambria Math" w:hAnsi="Cambria Math" w:cs="B Yekan"/>
+                  <w:lang w:bidi="fa-IR"/>
+                </w:rPr>
+                <m:t>0</m:t>
+              </m:r>
+            </m:sub>
+          </m:sSub>
+        </m:oMath>
+      </m:oMathPara>
+    </w:p>
+    <w:p>
+      <w:pPr>
+        <w:bidi/>
+        <w:rPr>
+          <w:rFonts w:cs="B Yekan"/>
+          <w:rtl/>
+          <w:lang w:bidi="fa-IR"/>
+        </w:rPr>
+      </w:pPr>
+      <w:r>
+        <w:rPr>
+          <w:rFonts w:cs="B Yekan" w:hint="cs"/>
+          <w:rtl/>
+          <w:lang w:bidi="fa-IR"/>
+        </w:rPr>
+        <w:t xml:space="preserve">و در نهایت برای حاصل جمع </w:t>
+      </w:r>
+      <m:oMath>
+        <m:sSub>
+          <m:sSubPr>
+            <m:ctrlPr>
+              <w:rPr>
+                <w:rFonts w:ascii="Cambria Math" w:eastAsiaTheme="minorEastAsia" w:hAnsi="Cambria Math" w:cs="B Yekan"/>
+                <w:i/>
+                <w:lang w:bidi="fa-IR"/>
+              </w:rPr>
+            </m:ctrlPr>
+          </m:sSubPr>
+          <m:e>
+            <m:r>
+              <w:rPr>
+                <w:rFonts w:ascii="Cambria Math" w:eastAsiaTheme="minorEastAsia" w:hAnsi="Cambria Math" w:cs="B Yekan"/>
+                <w:lang w:bidi="fa-IR"/>
+              </w:rPr>
+              <m:t>S</m:t>
+            </m:r>
+          </m:e>
+          <m:sub>
+            <m:r>
+              <w:rPr>
+                <w:rFonts w:ascii="Cambria Math" w:eastAsiaTheme="minorEastAsia" w:hAnsi="Cambria Math" w:cs="B Yekan"/>
+                <w:lang w:bidi="fa-IR"/>
+              </w:rPr>
+              <m:t>i</m:t>
+            </m:r>
+          </m:sub>
+        </m:sSub>
+        <m:r>
+          <w:rPr>
+            <w:rFonts w:ascii="Cambria Math" w:eastAsiaTheme="minorEastAsia" w:hAnsi="Cambria Math" w:cs="B Yekan"/>
+            <w:lang w:bidi="fa-IR"/>
+          </w:rPr>
+          <m:t>=</m:t>
+        </m:r>
+        <m:sSub>
+          <m:sSubPr>
+            <m:ctrlPr>
+              <w:rPr>
+                <w:rFonts w:ascii="Cambria Math" w:eastAsiaTheme="minorEastAsia" w:hAnsi="Cambria Math" w:cs="B Yekan"/>
+                <w:i/>
+                <w:lang w:bidi="fa-IR"/>
+              </w:rPr>
+            </m:ctrlPr>
+          </m:sSubPr>
+          <m:e>
+            <m:r>
+              <w:rPr>
+                <w:rFonts w:ascii="Cambria Math" w:eastAsiaTheme="minorEastAsia" w:hAnsi="Cambria Math" w:cs="B Yekan"/>
+                <w:lang w:bidi="fa-IR"/>
+              </w:rPr>
+              <m:t>P</m:t>
+            </m:r>
+          </m:e>
+          <m:sub>
+            <m:r>
+              <w:rPr>
+                <w:rFonts w:ascii="Cambria Math" w:eastAsiaTheme="minorEastAsia" w:hAnsi="Cambria Math" w:cs="B Yekan"/>
+                <w:lang w:bidi="fa-IR"/>
+              </w:rPr>
+              <m:t>i</m:t>
+            </m:r>
+          </m:sub>
+        </m:sSub>
+        <m:r>
+          <w:rPr>
+            <w:rFonts w:ascii="Cambria Math" w:eastAsiaTheme="minorEastAsia" w:hAnsi="Cambria Math" w:cs="B Yekan"/>
+            <w:lang w:bidi="fa-IR"/>
+          </w:rPr>
+          <m:t>⊕</m:t>
+        </m:r>
+        <m:sSub>
+          <m:sSubPr>
+            <m:ctrlPr>
+              <w:rPr>
+                <w:rFonts w:ascii="Cambria Math" w:eastAsiaTheme="minorEastAsia" w:hAnsi="Cambria Math" w:cs="B Yekan"/>
+                <w:i/>
+                <w:lang w:bidi="fa-IR"/>
+              </w:rPr>
+            </m:ctrlPr>
+          </m:sSubPr>
+          <m:e>
+            <m:r>
+              <w:rPr>
+                <w:rFonts w:ascii="Cambria Math" w:eastAsiaTheme="minorEastAsia" w:hAnsi="Cambria Math" w:cs="B Yekan"/>
+                <w:lang w:bidi="fa-IR"/>
+              </w:rPr>
+              <m:t>C</m:t>
+            </m:r>
+          </m:e>
+          <m:sub>
+            <m:r>
+              <w:rPr>
+                <w:rFonts w:ascii="Cambria Math" w:eastAsiaTheme="minorEastAsia" w:hAnsi="Cambria Math" w:cs="B Yekan"/>
+                <w:lang w:bidi="fa-IR"/>
+              </w:rPr>
+              <m:t>i</m:t>
+            </m:r>
+          </m:sub>
+        </m:sSub>
+      </m:oMath>
+      <w:r>
+        <w:rPr>
+          <w:rFonts w:cs="B Yekan" w:hint="cs"/>
+          <w:rtl/>
+          <w:lang w:bidi="fa-IR"/>
+        </w:rPr>
+        <w:t xml:space="preserve"> محاسبه می‌شود.</w:t>
+      </w:r>
+      <w:r>
+        <w:rPr>
+          <w:rFonts w:cs="B Yekan"/>
+          <w:lang w:bidi="fa-IR"/>
+        </w:rPr>
+        <w:t xml:space="preserve"> </w:t>
+      </w:r>
+      <w:r>
+        <w:rPr>
+          <w:rFonts w:cs="B Yekan" w:hint="cs"/>
+          <w:rtl/>
+          <w:lang w:bidi="fa-IR"/>
+        </w:rPr>
+        <w:t xml:space="preserve">حاصل جمع عدد پنج بیتی </w:t>
+      </w:r>
+      <m:oMath>
+        <m:acc>
+          <m:accPr>
+            <m:chr m:val="̅"/>
+            <m:ctrlPr>
+              <w:rPr>
+                <w:rFonts w:ascii="Cambria Math" w:hAnsi="Cambria Math" w:cs="B Yekan"/>
+                <w:i/>
+                <w:lang w:bidi="fa-IR"/>
+              </w:rPr>
+            </m:ctrlPr>
+          </m:accPr>
+          <m:e>
+            <m:sSub>
+              <m:sSubPr>
+                <m:ctrlPr>
+                  <w:rPr>
+                    <w:rFonts w:ascii="Cambria Math" w:hAnsi="Cambria Math" w:cs="B Yekan"/>
+                    <w:i/>
+                    <w:lang w:bidi="fa-IR"/>
+                  </w:rPr>
+                </m:ctrlPr>
+              </m:sSubPr>
+              <m:e>
+                <m:r>
+                  <w:rPr>
+                    <w:rFonts w:ascii="Cambria Math" w:hAnsi="Cambria Math" w:cs="B Yekan"/>
+                    <w:lang w:bidi="fa-IR"/>
+                  </w:rPr>
+                  <m:t>C</m:t>
+                </m:r>
+              </m:e>
+              <m:sub>
+                <m:r>
+                  <w:rPr>
+                    <w:rFonts w:ascii="Cambria Math" w:hAnsi="Cambria Math" w:cs="B Yekan"/>
+                    <w:lang w:bidi="fa-IR"/>
+                  </w:rPr>
+                  <m:t>4</m:t>
+                </m:r>
+              </m:sub>
+            </m:sSub>
+            <m:sSub>
+              <m:sSubPr>
+                <m:ctrlPr>
+                  <w:rPr>
+                    <w:rFonts w:ascii="Cambria Math" w:hAnsi="Cambria Math" w:cs="B Yekan"/>
+                    <w:i/>
+                    <w:lang w:bidi="fa-IR"/>
+                  </w:rPr>
+                </m:ctrlPr>
+              </m:sSubPr>
+              <m:e>
+                <m:r>
+                  <w:rPr>
+                    <w:rFonts w:ascii="Cambria Math" w:hAnsi="Cambria Math" w:cs="B Yekan"/>
+                    <w:lang w:bidi="fa-IR"/>
+                  </w:rPr>
+                  <m:t>S</m:t>
+                </m:r>
+              </m:e>
+              <m:sub>
+                <m:r>
+                  <w:rPr>
+                    <w:rFonts w:ascii="Cambria Math" w:hAnsi="Cambria Math" w:cs="B Yekan"/>
+                    <w:lang w:bidi="fa-IR"/>
+                  </w:rPr>
+                  <m:t>3</m:t>
+                </m:r>
+              </m:sub>
+            </m:sSub>
+            <m:sSub>
+              <m:sSubPr>
+                <m:ctrlPr>
+                  <w:rPr>
+                    <w:rFonts w:ascii="Cambria Math" w:hAnsi="Cambria Math" w:cs="B Yekan"/>
+                    <w:i/>
+                    <w:lang w:bidi="fa-IR"/>
+                  </w:rPr>
+                </m:ctrlPr>
+              </m:sSubPr>
+              <m:e>
+                <m:r>
+                  <w:rPr>
+                    <w:rFonts w:ascii="Cambria Math" w:hAnsi="Cambria Math" w:cs="B Yekan"/>
+                    <w:lang w:bidi="fa-IR"/>
+                  </w:rPr>
+                  <m:t>S</m:t>
+                </m:r>
+              </m:e>
+              <m:sub>
+                <m:r>
+                  <w:rPr>
+                    <w:rFonts w:ascii="Cambria Math" w:hAnsi="Cambria Math" w:cs="B Yekan"/>
+                    <w:lang w:bidi="fa-IR"/>
+                  </w:rPr>
+                  <m:t>2</m:t>
+                </m:r>
+              </m:sub>
+            </m:sSub>
+            <m:sSub>
+              <m:sSubPr>
+                <m:ctrlPr>
+                  <w:rPr>
+                    <w:rFonts w:ascii="Cambria Math" w:hAnsi="Cambria Math" w:cs="B Yekan"/>
+                    <w:i/>
+                    <w:lang w:bidi="fa-IR"/>
+                  </w:rPr>
+                </m:ctrlPr>
+              </m:sSubPr>
+              <m:e>
+                <m:r>
+                  <w:rPr>
+                    <w:rFonts w:ascii="Cambria Math" w:hAnsi="Cambria Math" w:cs="B Yekan"/>
+                    <w:lang w:bidi="fa-IR"/>
+                  </w:rPr>
+                  <m:t>S</m:t>
+                </m:r>
+              </m:e>
+              <m:sub>
+                <m:r>
+                  <w:rPr>
+                    <w:rFonts w:ascii="Cambria Math" w:hAnsi="Cambria Math" w:cs="B Yekan"/>
+                    <w:lang w:bidi="fa-IR"/>
+                  </w:rPr>
+                  <m:t>1</m:t>
+                </m:r>
+              </m:sub>
+            </m:sSub>
+            <m:sSub>
+              <m:sSubPr>
+                <m:ctrlPr>
+                  <w:rPr>
+                    <w:rFonts w:ascii="Cambria Math" w:hAnsi="Cambria Math" w:cs="B Yekan"/>
+                    <w:i/>
+                    <w:lang w:bidi="fa-IR"/>
+                  </w:rPr>
+                </m:ctrlPr>
+              </m:sSubPr>
+              <m:e>
+                <m:r>
+                  <w:rPr>
+                    <w:rFonts w:ascii="Cambria Math" w:hAnsi="Cambria Math" w:cs="B Yekan"/>
+                    <w:lang w:bidi="fa-IR"/>
+                  </w:rPr>
+                  <m:t>S</m:t>
+                </m:r>
+              </m:e>
+              <m:sub>
+                <m:r>
+                  <w:rPr>
+                    <w:rFonts w:ascii="Cambria Math" w:hAnsi="Cambria Math" w:cs="B Yekan"/>
+                    <w:lang w:bidi="fa-IR"/>
+                  </w:rPr>
+                  <m:t>0</m:t>
+                </m:r>
+              </m:sub>
+            </m:sSub>
+          </m:e>
+        </m:acc>
+      </m:oMath>
+      <w:r>
+        <w:rPr>
+          <w:rFonts w:eastAsiaTheme="minorEastAsia" w:cs="B Yekan" w:hint="cs"/>
+          <w:rtl/>
+          <w:lang w:bidi="fa-IR"/>
+        </w:rPr>
+        <w:t xml:space="preserve"> است.</w:t>
+      </w:r>
+    </w:p>
+    <w:p>
+      <w:pPr>
+        <w:bidi/>
+        <w:rPr>
+          <w:rFonts w:cs="B Yekan"/>
+          <w:rtl/>
+          <w:lang w:bidi="fa-IR"/>
+        </w:rPr>
+      </w:pPr>
+      <w:r>
+        <w:rPr>
+          <w:rFonts w:cs="B Yekan" w:hint="cs"/>
+          <w:rtl/>
+          <w:lang w:bidi="fa-IR"/>
+        </w:rPr>
+        <w:t>مدار را در نرم افزار رسم می‌کنیم.</w:t>
+      </w:r>
+    </w:p>
+    <w:p>
+      <w:pPr>
         <w:tabs>
           <w:tab w:val="left" w:pos="2096"/>
         </w:tabs>
+        <w:jc w:val="right"/>
+        <w:rPr>
+          <w:rtl/>
+          <w:lang w:bidi="fa-IR"/>
+        </w:rPr>
       </w:pPr>
     </w:p>
     <w:p>
+      <w:pPr>
+        <w:bidi/>
+        <w:rPr>
+          <w:rFonts w:cs="B Yekan"/>
+          <w:rtl/>
+          <w:lang w:bidi="fa-IR"/>
+        </w:rPr>
+      </w:pPr>
       <w:r>
         <w:br w:type="page"/>
       </w:r>
+    </w:p>
+    <w:p>
+      <w:pPr>
+        <w:jc w:val="right"/>
+        <w:rPr>
+          <w:lang w:bidi="fa-IR"/>
+        </w:rPr>
+      </w:pPr>
     </w:p>
     <w:tbl>
       <w:tblPr>
@@ -958,7 +3648,323 @@
             <w:pPr>
               <w:jc w:val="right"/>
               <w:rPr>
+                <w:rFonts w:cs="B Yekan"/>
+                <w:sz w:val="20"/>
+                <w:szCs w:val="20"/>
+                <w:rtl/>
+                <w:lang w:bidi="fa-IR"/>
+              </w:rPr>
+            </w:pPr>
+            <w:r>
+              <w:rPr>
                 <w:rFonts w:cs="B Yekan" w:hint="cs"/>
+                <w:sz w:val="20"/>
+                <w:szCs w:val="20"/>
+                <w:rtl/>
+                <w:lang w:bidi="fa-IR"/>
+              </w:rPr>
+              <w:t>گزارش کار آزمایش شماره 1</w:t>
+            </w:r>
+          </w:p>
+        </w:tc>
+        <w:tc>
+          <w:tcPr>
+            <w:tcW w:w="2338" w:type="dxa"/>
+          </w:tcPr>
+          <w:p>
+            <w:pPr>
+              <w:jc w:val="center"/>
+              <w:rPr>
+                <w:rFonts w:cs="B Yekan"/>
+                <w:sz w:val="20"/>
+                <w:szCs w:val="20"/>
+                <w:rtl/>
+                <w:lang w:bidi="fa-IR"/>
+              </w:rPr>
+            </w:pPr>
+          </w:p>
+        </w:tc>
+        <w:tc>
+          <w:tcPr>
+            <w:tcW w:w="5585" w:type="dxa"/>
+          </w:tcPr>
+          <w:p>
+            <w:pPr>
+              <w:jc w:val="right"/>
+              <w:rPr>
+                <w:rFonts w:cs="B Yekan"/>
+                <w:sz w:val="20"/>
+                <w:szCs w:val="20"/>
+                <w:rtl/>
+                <w:lang w:bidi="fa-IR"/>
+              </w:rPr>
+            </w:pPr>
+            <w:r>
+              <w:rPr>
+                <w:rFonts w:cs="B Yekan" w:hint="cs"/>
+                <w:sz w:val="20"/>
+                <w:szCs w:val="20"/>
+                <w:rtl/>
+                <w:lang w:bidi="fa-IR"/>
+              </w:rPr>
+              <w:t xml:space="preserve">آزمایشگاه مدار های منطقی </w:t>
+            </w:r>
+            <w:r>
+              <w:rPr>
+                <w:rFonts w:ascii="Arial" w:hAnsi="Arial" w:cs="Arial" w:hint="cs"/>
+                <w:sz w:val="20"/>
+                <w:szCs w:val="20"/>
+                <w:rtl/>
+                <w:lang w:bidi="fa-IR"/>
+              </w:rPr>
+              <w:t>–</w:t>
+            </w:r>
+            <w:r>
+              <w:rPr>
+                <w:rFonts w:cs="B Yekan" w:hint="cs"/>
+                <w:sz w:val="20"/>
+                <w:szCs w:val="20"/>
+                <w:rtl/>
+                <w:lang w:bidi="fa-IR"/>
+              </w:rPr>
+              <w:t xml:space="preserve"> گروه شماره </w:t>
+            </w:r>
+            <w:r>
+              <w:rPr>
+                <w:rFonts w:cs="B Yekan" w:hint="cs"/>
+                <w:sz w:val="20"/>
+                <w:szCs w:val="20"/>
+                <w:rtl/>
+                <w:lang w:bidi="fa-IR"/>
+              </w:rPr>
+              <w:t>7</w:t>
+            </w:r>
+          </w:p>
+        </w:tc>
+      </w:tr>
+    </w:tbl>
+    <w:p>
+      <w:pPr>
+        <w:pStyle w:val="Caption"/>
+        <w:keepNext/>
+        <w:jc w:val="center"/>
+        <w:rPr>
+          <w:lang w:bidi="fa-IR"/>
+        </w:rPr>
+      </w:pPr>
+      <w:r>
+        <w:rPr>
+          <w:rFonts w:ascii="Cambria Math" w:eastAsiaTheme="minorEastAsia" w:hAnsi="Cambria Math" w:cs="B Yekan"/>
+          <w:noProof/>
+          <w:rtl/>
+          <w:lang w:bidi="fa-IR"/>
+        </w:rPr>
+        <w:drawing>
+          <wp:inline distT="0" distB="0" distL="0" distR="0" wp14:anchorId="267DC80C" wp14:editId="6987DF3D">
+            <wp:extent cx="5665989" cy="4743450"/>
+            <wp:effectExtent l="0" t="0" r="0" b="0"/>
+            <wp:docPr id="165243746" name="Picture 1"/>
+            <wp:cNvGraphicFramePr>
+              <a:graphicFrameLocks xmlns:a="http://schemas.openxmlformats.org/drawingml/2006/main" noChangeAspect="1"/>
+            </wp:cNvGraphicFramePr>
+            <a:graphic xmlns:a="http://schemas.openxmlformats.org/drawingml/2006/main">
+              <a:graphicData uri="http://schemas.openxmlformats.org/drawingml/2006/picture">
+                <pic:pic xmlns:pic="http://schemas.openxmlformats.org/drawingml/2006/picture">
+                  <pic:nvPicPr>
+                    <pic:cNvPr id="165243746" name=""/>
+                    <pic:cNvPicPr/>
+                  </pic:nvPicPr>
+                  <pic:blipFill>
+                    <a:blip r:embed="rId7"/>
+                    <a:stretch>
+                      <a:fillRect/>
+                    </a:stretch>
+                  </pic:blipFill>
+                  <pic:spPr>
+                    <a:xfrm>
+                      <a:off x="0" y="0"/>
+                      <a:ext cx="5667322" cy="4744566"/>
+                    </a:xfrm>
+                    <a:prstGeom prst="rect">
+                      <a:avLst/>
+                    </a:prstGeom>
+                  </pic:spPr>
+                </pic:pic>
+              </a:graphicData>
+            </a:graphic>
+          </wp:inline>
+        </w:drawing>
+      </w:r>
+    </w:p>
+    <w:p>
+      <w:pPr>
+        <w:bidi/>
+        <w:spacing w:after="60" w:line="240" w:lineRule="auto"/>
+        <w:jc w:val="center"/>
+        <w:rPr>
+          <w:lang w:bidi="fa-IR"/>
+        </w:rPr>
+      </w:pPr>
+      <w:r>
+        <w:rPr>
+          <w:rFonts w:ascii="B Yekan" w:eastAsia="B Yekan" w:hAnsi="B Yekan" w:cs="B Yekan"/>
+          <w:b/>
+          <w:sz w:val="20"/>
+          <w:rtl/>
+          <w:lang w:bidi="fa-IR"/>
+        </w:rPr>
+        <w:t xml:space="preserve">شکل </w:t>
+      </w:r>
+      <w:dir w:val="ltr">
+        <w:r>
+          <w:rPr>
+            <w:rFonts w:ascii="B Yekan" w:eastAsia="B Yekan" w:hAnsi="B Yekan" w:cs="B Yekan"/>
+            <w:b/>
+            <w:sz w:val="20"/>
+            <w:rtl/>
+            <w:lang w:bidi="fa-IR"/>
+          </w:rPr>
+          <w:t>3-1</w:t>
+        </w:r>
+        <w:r>
+          <w:rPr>
+            <w:rFonts w:ascii="B Yekan" w:eastAsia="B Yekan" w:hAnsi="B Yekan" w:cs="B Yekan"/>
+            <w:b/>
+            <w:sz w:val="20"/>
+            <w:rtl/>
+            <w:lang w:bidi="fa-IR"/>
+          </w:rPr>
+          <w:t>‬: مدار کامل جمع‌کننده‌ی چهاربیتی</w:t>
+        </w:r>
+      </w:dir>
+    </w:p>
+    <w:p>
+      <w:pPr>
+        <w:bidi/>
+        <w:spacing w:after="60" w:line="240" w:lineRule="auto"/>
+        <w:jc w:val="center"/>
+        <w:rPr>
+          <w:rFonts w:eastAsiaTheme="minorEastAsia" w:cs="B Yekan"/>
+          <w:lang w:bidi="fa-IR"/>
+        </w:rPr>
+      </w:pPr>
+      <w:r>
+        <w:rPr>
+          <w:rFonts w:ascii="Cambria Math" w:eastAsiaTheme="minorEastAsia" w:hAnsi="Cambria Math" w:cs="B Yekan"/>
+          <w:i/>
+          <w:lang w:bidi="fa-IR"/>
+        </w:rPr>
+        <w:br/>
+      </w:r>
+      <w:r>
+        <w:rPr>
+          <w:rFonts w:eastAsiaTheme="minorEastAsia" w:cs="B Yekan"/>
+          <w:noProof/>
+          <w:rtl/>
+          <w:lang w:bidi="fa-IR"/>
+        </w:rPr>
+        <w:drawing>
+          <wp:inline distT="0" distB="0" distL="0" distR="0" wp14:anchorId="3B38584C" wp14:editId="13F12CFC">
+            <wp:extent cx="5708650" cy="2248086"/>
+            <wp:effectExtent l="0" t="0" r="6350" b="0"/>
+            <wp:docPr id="2006756646" name="Picture 1"/>
+            <wp:cNvGraphicFramePr>
+              <a:graphicFrameLocks xmlns:a="http://schemas.openxmlformats.org/drawingml/2006/main" noChangeAspect="1"/>
+            </wp:cNvGraphicFramePr>
+            <a:graphic xmlns:a="http://schemas.openxmlformats.org/drawingml/2006/main">
+              <a:graphicData uri="http://schemas.openxmlformats.org/drawingml/2006/picture">
+                <pic:pic xmlns:pic="http://schemas.openxmlformats.org/drawingml/2006/picture">
+                  <pic:nvPicPr>
+                    <pic:cNvPr id="2006756646" name=""/>
+                    <pic:cNvPicPr/>
+                  </pic:nvPicPr>
+                  <pic:blipFill>
+                    <a:blip r:embed="rId8"/>
+                    <a:stretch>
+                      <a:fillRect/>
+                    </a:stretch>
+                  </pic:blipFill>
+                  <pic:spPr>
+                    <a:xfrm>
+                      <a:off x="0" y="0"/>
+                      <a:ext cx="5717457" cy="2251554"/>
+                    </a:xfrm>
+                    <a:prstGeom prst="rect">
+                      <a:avLst/>
+                    </a:prstGeom>
+                  </pic:spPr>
+                </pic:pic>
+              </a:graphicData>
+            </a:graphic>
+          </wp:inline>
+        </w:drawing>
+      </w:r>
+      <w:r>
+        <w:br/>
+      </w:r>
+      <w:r>
+        <w:rPr>
+          <w:rFonts w:ascii="B Yekan" w:eastAsia="B Yekan" w:hAnsi="B Yekan" w:cs="B Yekan"/>
+          <w:b/>
+          <w:sz w:val="20"/>
+          <w:rtl/>
+          <w:lang w:bidi="fa-IR"/>
+        </w:rPr>
+        <w:t xml:space="preserve">شکل </w:t>
+      </w:r>
+      <w:dir w:val="ltr">
+        <w:r>
+          <w:rPr>
+            <w:rFonts w:ascii="B Yekan" w:eastAsia="B Yekan" w:hAnsi="B Yekan" w:cs="B Yekan"/>
+            <w:b/>
+            <w:sz w:val="20"/>
+            <w:rtl/>
+            <w:lang w:bidi="fa-IR"/>
+          </w:rPr>
+          <w:t>3-2</w:t>
+        </w:r>
+        <w:r>
+          <w:rPr>
+            <w:rFonts w:ascii="B Yekan" w:eastAsia="B Yekan" w:hAnsi="B Yekan" w:cs="B Yekan"/>
+            <w:b/>
+            <w:sz w:val="20"/>
+            <w:rtl/>
+            <w:lang w:bidi="fa-IR"/>
+          </w:rPr>
+          <w:t xml:space="preserve">‬: نمای بخش بالایی مدار </w:t>
+        </w:r>
+      </w:dir>
+    </w:p>
+    <w:tbl>
+      <w:tblPr>
+        <w:tblStyle w:val="TableGrid"/>
+        <w:tblpPr w:leftFromText="180" w:rightFromText="180" w:vertAnchor="page" w:horzAnchor="margin" w:tblpX="-900" w:tblpY="617"/>
+        <w:tblW w:w="11160" w:type="dxa"/>
+        <w:tblBorders>
+          <w:top w:val="none" w:sz="0" w:space="0" w:color="auto"/>
+          <w:left w:val="none" w:sz="0" w:space="0" w:color="auto"/>
+          <w:bottom w:val="double" w:sz="12" w:space="0" w:color="auto"/>
+          <w:right w:val="none" w:sz="0" w:space="0" w:color="auto"/>
+          <w:insideH w:val="none" w:sz="0" w:space="0" w:color="auto"/>
+          <w:insideV w:val="none" w:sz="0" w:space="0" w:color="auto"/>
+        </w:tblBorders>
+        <w:tblLook w:val="04A0" w:firstRow="1" w:lastRow="0" w:firstColumn="1" w:lastColumn="0" w:noHBand="0" w:noVBand="1"/>
+      </w:tblPr>
+      <w:tblGrid>
+        <w:gridCol w:w="3237"/>
+        <w:gridCol w:w="2338"/>
+        <w:gridCol w:w="5585"/>
+      </w:tblGrid>
+      <w:tr>
+        <w:tc>
+          <w:tcPr>
+            <w:tcW w:w="3237" w:type="dxa"/>
+          </w:tcPr>
+          <w:p>
+            <w:pPr>
+              <w:jc w:val="right"/>
+              <w:rPr>
+                <w:rFonts w:cs="B Yekan"/>
                 <w:sz w:val="20"/>
                 <w:szCs w:val="20"/>
                 <w:rtl/>
@@ -986,7 +3992,7 @@
             <w:pPr>
               <w:jc w:val="center"/>
               <w:rPr>
-                <w:rFonts w:cs="B Yekan" w:hint="cs"/>
+                <w:rFonts w:cs="B Yekan"/>
                 <w:sz w:val="20"/>
                 <w:szCs w:val="20"/>
                 <w:rtl/>
@@ -1003,13 +4009,33 @@
             <w:pPr>
               <w:jc w:val="right"/>
               <w:rPr>
+                <w:rFonts w:cs="B Yekan"/>
+                <w:sz w:val="20"/>
+                <w:szCs w:val="20"/>
+                <w:rtl/>
+                <w:lang w:bidi="fa-IR"/>
+              </w:rPr>
+            </w:pPr>
+            <w:r>
+              <w:rPr>
                 <w:rFonts w:cs="B Yekan" w:hint="cs"/>
                 <w:sz w:val="20"/>
                 <w:szCs w:val="20"/>
                 <w:rtl/>
                 <w:lang w:bidi="fa-IR"/>
               </w:rPr>
-            </w:pPr>
+              <w:t xml:space="preserve">آزمایشگاه مدار های منطقی </w:t>
+            </w:r>
+            <w:r>
+              <w:rPr>
+                <w:rFonts w:ascii="Arial" w:hAnsi="Arial" w:cs="Arial" w:hint="cs"/>
+                <w:sz w:val="20"/>
+                <w:szCs w:val="20"/>
+                <w:rtl/>
+                <w:lang w:bidi="fa-IR"/>
+              </w:rPr>
+              <w:t>–</w:t>
+            </w:r>
             <w:r>
               <w:rPr>
                 <w:rFonts w:cs="B Yekan" w:hint="cs"/>
@@ -1018,27 +4044,7 @@
                 <w:rtl/>
                 <w:lang w:bidi="fa-IR"/>
               </w:rPr>
-              <w:t xml:space="preserve">آزمایشگاه مدار های منطقی </w:t>
-            </w:r>
-            <w:r>
-              <w:rPr>
-                <w:rFonts w:ascii="Arial" w:hAnsi="Arial" w:cs="Arial" w:hint="cs"/>
-                <w:sz w:val="20"/>
-                <w:szCs w:val="20"/>
-                <w:rtl/>
-                <w:lang w:bidi="fa-IR"/>
-              </w:rPr>
-              <w:t>–</w:t>
-            </w:r>
-            <w:r>
-              <w:rPr>
-                <w:rFonts w:cs="B Yekan" w:hint="cs"/>
-                <w:sz w:val="20"/>
-                <w:szCs w:val="20"/>
-                <w:rtl/>
-                <w:lang w:bidi="fa-IR"/>
-              </w:rPr>
-              <w:t xml:space="preserve"> گروه شماره 2</w:t>
+              <w:t xml:space="preserve"> گروه شماره 7</w:t>
             </w:r>
           </w:p>
         </w:tc>
@@ -1046,18 +4052,98 @@
     </w:tbl>
     <w:p>
       <w:pPr>
-        <w:tabs>
-          <w:tab w:val="left" w:pos="2096"/>
-        </w:tabs>
+        <w:bidi/>
+        <w:spacing w:after="60" w:line="240" w:lineRule="auto"/>
+        <w:jc w:val="center"/>
+        <w:rPr>
+          <w:rFonts w:cs="B Yekan"/>
+          <w:rtl/>
+          <w:lang w:bidi="fa-IR"/>
+        </w:rPr>
       </w:pPr>
+      <w:r>
+        <w:rPr>
+          <w:rFonts w:cs="B Yekan"/>
+          <w:noProof/>
+          <w:rtl/>
+          <w:lang w:bidi="fa-IR"/>
+        </w:rPr>
+        <w:drawing>
+          <wp:inline distT="0" distB="0" distL="0" distR="0" wp14:anchorId="7796839B" wp14:editId="0CDD602C">
+            <wp:extent cx="5943600" cy="2685415"/>
+            <wp:effectExtent l="0" t="0" r="0" b="635"/>
+            <wp:docPr id="1182849074" name="Picture 1"/>
+            <wp:cNvGraphicFramePr>
+              <a:graphicFrameLocks xmlns:a="http://schemas.openxmlformats.org/drawingml/2006/main" noChangeAspect="1"/>
+            </wp:cNvGraphicFramePr>
+            <a:graphic xmlns:a="http://schemas.openxmlformats.org/drawingml/2006/main">
+              <a:graphicData uri="http://schemas.openxmlformats.org/drawingml/2006/picture">
+                <pic:pic xmlns:pic="http://schemas.openxmlformats.org/drawingml/2006/picture">
+                  <pic:nvPicPr>
+                    <pic:cNvPr id="1182849074" name=""/>
+                    <pic:cNvPicPr/>
+                  </pic:nvPicPr>
+                  <pic:blipFill>
+                    <a:blip r:embed="rId9"/>
+                    <a:stretch>
+                      <a:fillRect/>
+                    </a:stretch>
+                  </pic:blipFill>
+                  <pic:spPr>
+                    <a:xfrm>
+                      <a:off x="0" y="0"/>
+                      <a:ext cx="5943600" cy="2685415"/>
+                    </a:xfrm>
+                    <a:prstGeom prst="rect">
+                      <a:avLst/>
+                    </a:prstGeom>
+                  </pic:spPr>
+                </pic:pic>
+              </a:graphicData>
+            </a:graphic>
+          </wp:inline>
+        </w:drawing>
+      </w:r>
+      <w:r>
+        <w:br/>
+      </w:r>
+      <w:r>
+        <w:rPr>
+          <w:rFonts w:ascii="B Yekan" w:eastAsia="B Yekan" w:hAnsi="B Yekan" w:cs="B Yekan"/>
+          <w:b/>
+          <w:sz w:val="20"/>
+          <w:rtl/>
+          <w:lang w:bidi="fa-IR"/>
+        </w:rPr>
+        <w:t xml:space="preserve">شکل </w:t>
+      </w:r>
+      <w:dir w:val="ltr">
+        <w:r>
+          <w:rPr>
+            <w:rFonts w:ascii="B Yekan" w:eastAsia="B Yekan" w:hAnsi="B Yekan" w:cs="B Yekan"/>
+            <w:b/>
+            <w:sz w:val="20"/>
+            <w:rtl/>
+            <w:lang w:bidi="fa-IR"/>
+          </w:rPr>
+          <w:t>3-3</w:t>
+        </w:r>
+        <w:r>
+          <w:rPr>
+            <w:rFonts w:ascii="B Yekan" w:eastAsia="B Yekan" w:hAnsi="B Yekan" w:cs="B Yekan"/>
+            <w:b/>
+            <w:sz w:val="20"/>
+            <w:rtl/>
+            <w:lang w:bidi="fa-IR"/>
+          </w:rPr>
+          <w:t>‬: نمای بخش پایینی مدار</w:t>
+        </w:r>
+      </w:dir>
     </w:p>
     <w:sectPr>
-      <w:headerReference w:type="even" r:id="rId7"/>
-      <w:headerReference w:type="default" r:id="rId8"/>
-      <w:footerReference w:type="even" r:id="rId9"/>
-      <w:footerReference w:type="default" r:id="rId10"/>
-      <w:headerReference w:type="first" r:id="rId11"/>
-      <w:footerReference w:type="first" r:id="rId12"/>
+      <w:headerReference w:type="even" r:id="rId10"/>
+      <w:headerReference w:type="default" r:id="rId11"/>
+      <w:headerReference w:type="first" r:id="rId12"/>
       <w:pgSz w:w="12240" w:h="15840"/>
       <w:pgMar w:top="1440" w:right="1440" w:bottom="1440" w:left="1440" w:header="720" w:footer="720" w:gutter="0"/>
       <w:pgBorders w:offsetFrom="page">
@@ -1096,36 +4182,6 @@
     </w:p>
   </w:endnote>
 </w:endnotes>
-</file>
-
-<file path=word/footer1.xml><?xml version="1.0" encoding="utf-8"?>
-<w:ftr xmlns:wpc="http://schemas.microsoft.com/office/word/2010/wordprocessingCanvas" xmlns:cx="http://schemas.microsoft.com/office/drawing/2014/chartex" xmlns:cx1="http://schemas.microsoft.com/office/drawing/2015/9/8/chartex" xmlns:cx2="http://schemas.microsoft.com/office/drawing/2015/10/21/chartex" xmlns:cx3="http://schemas.microsoft.com/office/drawing/2016/5/9/chartex" xmlns:cx4="http://schemas.microsoft.com/office/drawing/2016/5/10/chartex" xmlns:cx5="http://schemas.microsoft.com/office/drawing/2016/5/11/chartex" xmlns:cx6="http://schemas.microsoft.com/office/drawing/2016/5/12/chartex" xmlns:cx7="http://schemas.microsoft.com/office/drawing/2016/5/13/chartex" xmlns:cx8="http://schemas.microsoft.com/office/drawing/2016/5/14/chartex" xmlns:mc="http://schemas.openxmlformats.org/markup-compatibility/2006" xmlns:aink="http://schemas.microsoft.com/office/drawing/2016/ink" xmlns:am3d="http://schemas.microsoft.com/office/drawing/2017/model3d" xmlns:o="urn:schemas-microsoft-com:office:office" xmlns:oel="http://schemas.microsoft.com/office/2019/extlst" xmlns:r="http://schemas.openxmlformats.org/officeDocument/2006/relationships" xmlns:m="http://schemas.openxmlformats.org/officeDocument/2006/math" xmlns:v="urn:schemas-microsoft-com:vml" xmlns:wp14="http://schemas.microsoft.com/office/word/2010/wordprocessingDrawing" xmlns:wp="http://schemas.openxmlformats.org/drawingml/2006/wordprocessingDrawing" xmlns:w10="urn:schemas-microsoft-com:office:word" xmlns:w="http://schemas.openxmlformats.org/wordprocessingml/2006/main" xmlns:w14="http://schemas.microsoft.com/office/word/2010/wordml" xmlns:w15="http://schemas.microsoft.com/office/word/2012/wordml" xmlns:w16cei="http://schemas.microsoft.com/office/word/2026/wordml/cei" xmlns:w16cex="http://schemas.microsoft.com/office/word/2018/wordml/cex" xmlns:w16cid="http://schemas.microsoft.com/office/word/2016/wordml/cid" xmlns:w16="http://schemas.microsoft.com/office/word/2018/wordml" xmlns:w16du="http://schemas.microsoft.com/office/word/2023/wordml/word16du" xmlns:w16sdtdh="http://schemas.microsoft.com/office/word/2020/wordml/sdtdatahash" xmlns:w16sdtfl="http://schemas.microsoft.com/office/word/2024/wordml/sdtformatlock" xmlns:w16se="http://schemas.microsoft.com/office/word/2015/wordml/symex" xmlns:wpg="http://schemas.microsoft.com/office/word/2010/wordprocessingGroup" xmlns:wpi="http://schemas.microsoft.com/office/word/2010/wordprocessingInk" xmlns:wne="http://schemas.microsoft.com/office/word/2006/wordml" xmlns:wps="http://schemas.microsoft.com/office/word/2010/wordprocessingShape" mc:Ignorable="w14 w15 w16se w16cid w16 w16cex w16sdtdh w16sdtfl w16du wp14">
-  <w:p>
-    <w:pPr>
-      <w:pStyle w:val="Footer"/>
-    </w:pPr>
-  </w:p>
-</w:ftr>
-</file>
-
-<file path=word/footer2.xml><?xml version="1.0" encoding="utf-8"?>
-<w:ftr xmlns:wpc="http://schemas.microsoft.com/office/word/2010/wordprocessingCanvas" xmlns:cx="http://schemas.microsoft.com/office/drawing/2014/chartex" xmlns:cx1="http://schemas.microsoft.com/office/drawing/2015/9/8/chartex" xmlns:cx2="http://schemas.microsoft.com/office/drawing/2015/10/21/chartex" xmlns:cx3="http://schemas.microsoft.com/office/drawing/2016/5/9/chartex" xmlns:cx4="http://schemas.microsoft.com/office/drawing/2016/5/10/chartex" xmlns:cx5="http://schemas.microsoft.com/office/drawing/2016/5/11/chartex" xmlns:cx6="http://schemas.microsoft.com/office/drawing/2016/5/12/chartex" xmlns:cx7="http://schemas.microsoft.com/office/drawing/2016/5/13/chartex" xmlns:cx8="http://schemas.microsoft.com/office/drawing/2016/5/14/chartex" xmlns:mc="http://schemas.openxmlformats.org/markup-compatibility/2006" xmlns:aink="http://schemas.microsoft.com/office/drawing/2016/ink" xmlns:am3d="http://schemas.microsoft.com/office/drawing/2017/model3d" xmlns:o="urn:schemas-microsoft-com:office:office" xmlns:oel="http://schemas.microsoft.com/office/2019/extlst" xmlns:r="http://schemas.openxmlformats.org/officeDocument/2006/relationships" xmlns:m="http://schemas.openxmlformats.org/officeDocument/2006/math" xmlns:v="urn:schemas-microsoft-com:vml" xmlns:wp14="http://schemas.microsoft.com/office/word/2010/wordprocessingDrawing" xmlns:wp="http://schemas.openxmlformats.org/drawingml/2006/wordprocessingDrawing" xmlns:w10="urn:schemas-microsoft-com:office:word" xmlns:w="http://schemas.openxmlformats.org/wordprocessingml/2006/main" xmlns:w14="http://schemas.microsoft.com/office/word/2010/wordml" xmlns:w15="http://schemas.microsoft.com/office/word/2012/wordml" xmlns:w16cei="http://schemas.microsoft.com/office/word/2026/wordml/cei" xmlns:w16cex="http://schemas.microsoft.com/office/word/2018/wordml/cex" xmlns:w16cid="http://schemas.microsoft.com/office/word/2016/wordml/cid" xmlns:w16="http://schemas.microsoft.com/office/word/2018/wordml" xmlns:w16du="http://schemas.microsoft.com/office/word/2023/wordml/word16du" xmlns:w16sdtdh="http://schemas.microsoft.com/office/word/2020/wordml/sdtdatahash" xmlns:w16sdtfl="http://schemas.microsoft.com/office/word/2024/wordml/sdtformatlock" xmlns:w16se="http://schemas.microsoft.com/office/word/2015/wordml/symex" xmlns:wpg="http://schemas.microsoft.com/office/word/2010/wordprocessingGroup" xmlns:wpi="http://schemas.microsoft.com/office/word/2010/wordprocessingInk" xmlns:wne="http://schemas.microsoft.com/office/word/2006/wordml" xmlns:wps="http://schemas.microsoft.com/office/word/2010/wordprocessingShape" mc:Ignorable="w14 w15 w16se w16cid w16 w16cex w16sdtdh w16sdtfl w16du wp14">
-  <w:p>
-    <w:pPr>
-      <w:pStyle w:val="Footer"/>
-    </w:pPr>
-  </w:p>
-</w:ftr>
-</file>
-
-<file path=word/footer3.xml><?xml version="1.0" encoding="utf-8"?>
-<w:ftr xmlns:wpc="http://schemas.microsoft.com/office/word/2010/wordprocessingCanvas" xmlns:cx="http://schemas.microsoft.com/office/drawing/2014/chartex" xmlns:cx1="http://schemas.microsoft.com/office/drawing/2015/9/8/chartex" xmlns:cx2="http://schemas.microsoft.com/office/drawing/2015/10/21/chartex" xmlns:cx3="http://schemas.microsoft.com/office/drawing/2016/5/9/chartex" xmlns:cx4="http://schemas.microsoft.com/office/drawing/2016/5/10/chartex" xmlns:cx5="http://schemas.microsoft.com/office/drawing/2016/5/11/chartex" xmlns:cx6="http://schemas.microsoft.com/office/drawing/2016/5/12/chartex" xmlns:cx7="http://schemas.microsoft.com/office/drawing/2016/5/13/chartex" xmlns:cx8="http://schemas.microsoft.com/office/drawing/2016/5/14/chartex" xmlns:mc="http://schemas.openxmlformats.org/markup-compatibility/2006" xmlns:aink="http://schemas.microsoft.com/office/drawing/2016/ink" xmlns:am3d="http://schemas.microsoft.com/office/drawing/2017/model3d" xmlns:o="urn:schemas-microsoft-com:office:office" xmlns:oel="http://schemas.microsoft.com/office/2019/extlst" xmlns:r="http://schemas.openxmlformats.org/officeDocument/2006/relationships" xmlns:m="http://schemas.openxmlformats.org/officeDocument/2006/math" xmlns:v="urn:schemas-microsoft-com:vml" xmlns:wp14="http://schemas.microsoft.com/office/word/2010/wordprocessingDrawing" xmlns:wp="http://schemas.openxmlformats.org/drawingml/2006/wordprocessingDrawing" xmlns:w10="urn:schemas-microsoft-com:office:word" xmlns:w="http://schemas.openxmlformats.org/wordprocessingml/2006/main" xmlns:w14="http://schemas.microsoft.com/office/word/2010/wordml" xmlns:w15="http://schemas.microsoft.com/office/word/2012/wordml" xmlns:w16cei="http://schemas.microsoft.com/office/word/2026/wordml/cei" xmlns:w16cex="http://schemas.microsoft.com/office/word/2018/wordml/cex" xmlns:w16cid="http://schemas.microsoft.com/office/word/2016/wordml/cid" xmlns:w16="http://schemas.microsoft.com/office/word/2018/wordml" xmlns:w16du="http://schemas.microsoft.com/office/word/2023/wordml/word16du" xmlns:w16sdtdh="http://schemas.microsoft.com/office/word/2020/wordml/sdtdatahash" xmlns:w16sdtfl="http://schemas.microsoft.com/office/word/2024/wordml/sdtformatlock" xmlns:w16se="http://schemas.microsoft.com/office/word/2015/wordml/symex" xmlns:wpg="http://schemas.microsoft.com/office/word/2010/wordprocessingGroup" xmlns:wpi="http://schemas.microsoft.com/office/word/2010/wordprocessingInk" xmlns:wne="http://schemas.microsoft.com/office/word/2006/wordml" xmlns:wps="http://schemas.microsoft.com/office/word/2010/wordprocessingShape" mc:Ignorable="w14 w15 w16se w16cid w16 w16cex w16sdtdh w16sdtfl w16du wp14">
-  <w:p>
-    <w:pPr>
-      <w:pStyle w:val="Footer"/>
-    </w:pPr>
-  </w:p>
-</w:ftr>
 </file>
 
 <file path=word/footnotes.xml><?xml version="1.0" encoding="utf-8"?>
@@ -1185,6 +4241,7 @@
         </v:shapetype>
         <v:shape id="WordPictureWatermark760411704" o:spid="_x0000_s1029" type="#_x0000_t75" style="position:absolute;margin-left:0;margin-top:0;width:467.65pt;height:467.65pt;z-index:-251657216;mso-position-horizontal:center;mso-position-horizontal-relative:margin;mso-position-vertical:center;mso-position-vertical-relative:margin" o:allowincell="f">
           <v:imagedata r:id="rId1" o:title="sharif-logo" gain="19661f" blacklevel="22938f"/>
+          <w10:wrap anchorx="margin" anchory="margin"/>
         </v:shape>
       </w:pict>
     </w:r>
@@ -1224,6 +4281,7 @@
         </v:shapetype>
         <v:shape id="WordPictureWatermark760411705" o:spid="_x0000_s1030" type="#_x0000_t75" style="position:absolute;margin-left:0;margin-top:0;width:467.65pt;height:467.65pt;z-index:-251656192;mso-position-horizontal:center;mso-position-horizontal-relative:margin;mso-position-vertical:center;mso-position-vertical-relative:margin" o:allowincell="f">
           <v:imagedata r:id="rId1" o:title="sharif-logo" gain="19661f" blacklevel="22938f"/>
+          <w10:wrap anchorx="margin" anchory="margin"/>
         </v:shape>
       </w:pict>
     </w:r>
@@ -1263,6 +4321,7 @@
         </v:shapetype>
         <v:shape id="WordPictureWatermark760411703" o:spid="_x0000_s1028" type="#_x0000_t75" style="position:absolute;margin-left:0;margin-top:0;width:467.65pt;height:467.65pt;z-index:-251658240;mso-position-horizontal:center;mso-position-horizontal-relative:margin;mso-position-vertical:center;mso-position-vertical-relative:margin" o:allowincell="f">
           <v:imagedata r:id="rId1" o:title="sharif-logo" gain="19661f" blacklevel="22938f"/>
+          <w10:wrap anchorx="margin" anchory="margin"/>
         </v:shape>
       </w:pict>
     </w:r>
@@ -1670,6 +4729,7 @@
   <w:style w:type="paragraph" w:default="1" w:styleId="Normal">
     <w:name w:val="Normal"/>
     <w:qFormat/>
+    <w:rsid w:val="00F53678"/>
   </w:style>
   <w:style w:type="paragraph" w:styleId="Heading1">
     <w:name w:val="heading 1"/>
@@ -2250,6 +5310,36 @@
       </w:tblBorders>
     </w:tblPr>
   </w:style>
+  <w:style w:type="character" w:styleId="PlaceholderText">
+    <w:name w:val="Placeholder Text"/>
+    <w:basedOn w:val="DefaultParagraphFont"/>
+    <w:uiPriority w:val="99"/>
+    <w:semiHidden/>
+    <w:rsid w:val="00724F73"/>
+    <w:rPr>
+      <w:color w:val="666666"/>
+    </w:rPr>
+  </w:style>
+  <w:style w:type="paragraph" w:styleId="Caption">
+    <w:name w:val="caption"/>
+    <w:basedOn w:val="Normal"/>
+    <w:next w:val="Normal"/>
+    <w:uiPriority w:val="35"/>
+    <w:semiHidden/>
+    <w:unhideWhenUsed/>
+    <w:qFormat/>
+    <w:rsid w:val="00664031"/>
+    <w:pPr>
+      <w:spacing w:after="200" w:line="240" w:lineRule="auto"/>
+    </w:pPr>
+    <w:rPr>
+      <w:i/>
+      <w:iCs/>
+      <w:color w:val="0E2841" w:themeColor="text2"/>
+      <w:sz w:val="18"/>
+      <w:szCs w:val="18"/>
+    </w:rPr>
+  </w:style>
 </w:styles>
 </file>
 

</xml_diff>